<commit_message>
end of the day commit
</commit_message>
<xml_diff>
--- a/p/grammar/grammar.docx
+++ b/p/grammar/grammar.docx
@@ -642,14 +642,12 @@
         </w:rPr>
         <w:t>“</w:t>
       </w:r>
-      <w:proofErr w:type="spellStart"/>
       <w:r>
         <w:rPr>
           <w:lang w:val="en-US"/>
         </w:rPr>
         <w:t>wa</w:t>
       </w:r>
-      <w:proofErr w:type="spellEnd"/>
       <w:r>
         <w:rPr>
           <w:lang w:val="ru-RU"/>
@@ -8386,7 +8384,6 @@
           <w:lang w:val="ce-Cyrl-RU"/>
         </w:rPr>
       </w:pPr>
-      <w:proofErr w:type="gramStart"/>
       <w:r>
         <w:rPr>
           <w:rFonts w:ascii="Calibri" w:hAnsi="Calibri" w:cs="Calibri"/>
@@ -8399,15 +8396,7 @@
           <w:rFonts w:ascii="Calibri" w:hAnsi="Calibri" w:cs="Calibri"/>
           <w:lang w:val="ru-RU"/>
         </w:rPr>
-        <w:t xml:space="preserve"> :</w:t>
-      </w:r>
-      <w:proofErr w:type="gramEnd"/>
-      <w:r>
-        <w:rPr>
-          <w:rFonts w:ascii="Calibri" w:hAnsi="Calibri" w:cs="Calibri"/>
-          <w:lang w:val="ru-RU"/>
-        </w:rPr>
-        <w:t xml:space="preserve"> </w:t>
+        <w:t xml:space="preserve"> : </w:t>
       </w:r>
       <w:r>
         <w:rPr>
@@ -10678,23 +10667,7 @@
               <w:rPr>
                 <w:rFonts w:ascii="Calibri" w:hAnsi="Calibri" w:cs="Calibri"/>
               </w:rPr>
-              <w:t>(</w:t>
-            </w:r>
-            <w:proofErr w:type="spellStart"/>
-            <w:proofErr w:type="gramStart"/>
-            <w:r>
-              <w:rPr>
-                <w:rFonts w:ascii="Calibri" w:hAnsi="Calibri" w:cs="Calibri"/>
-              </w:rPr>
-              <w:t>в,б</w:t>
-            </w:r>
-            <w:proofErr w:type="spellEnd"/>
-            <w:proofErr w:type="gramEnd"/>
-            <w:r>
-              <w:rPr>
-                <w:rFonts w:ascii="Calibri" w:hAnsi="Calibri" w:cs="Calibri"/>
-              </w:rPr>
-              <w:t>)</w:t>
+              <w:t>(в,б)</w:t>
             </w:r>
           </w:p>
         </w:tc>
@@ -10713,23 +10686,7 @@
               <w:rPr>
                 <w:rFonts w:ascii="Calibri" w:hAnsi="Calibri" w:cs="Calibri"/>
               </w:rPr>
-              <w:t>(</w:t>
-            </w:r>
-            <w:proofErr w:type="spellStart"/>
-            <w:proofErr w:type="gramStart"/>
-            <w:r>
-              <w:rPr>
-                <w:rFonts w:ascii="Calibri" w:hAnsi="Calibri" w:cs="Calibri"/>
-              </w:rPr>
-              <w:t>й,б</w:t>
-            </w:r>
-            <w:proofErr w:type="spellEnd"/>
-            <w:proofErr w:type="gramEnd"/>
-            <w:r>
-              <w:rPr>
-                <w:rFonts w:ascii="Calibri" w:hAnsi="Calibri" w:cs="Calibri"/>
-              </w:rPr>
-              <w:t>)</w:t>
+              <w:t>(й,б)</w:t>
             </w:r>
           </w:p>
         </w:tc>
@@ -10748,23 +10705,7 @@
               <w:rPr>
                 <w:rFonts w:ascii="Calibri" w:hAnsi="Calibri" w:cs="Calibri"/>
               </w:rPr>
-              <w:t>(</w:t>
-            </w:r>
-            <w:proofErr w:type="spellStart"/>
-            <w:proofErr w:type="gramStart"/>
-            <w:r>
-              <w:rPr>
-                <w:rFonts w:ascii="Calibri" w:hAnsi="Calibri" w:cs="Calibri"/>
-              </w:rPr>
-              <w:t>й,й</w:t>
-            </w:r>
-            <w:proofErr w:type="spellEnd"/>
-            <w:proofErr w:type="gramEnd"/>
-            <w:r>
-              <w:rPr>
-                <w:rFonts w:ascii="Calibri" w:hAnsi="Calibri" w:cs="Calibri"/>
-              </w:rPr>
-              <w:t>)</w:t>
+              <w:t>(й,й)</w:t>
             </w:r>
           </w:p>
         </w:tc>
@@ -10783,23 +10724,7 @@
               <w:rPr>
                 <w:rFonts w:ascii="Calibri" w:hAnsi="Calibri" w:cs="Calibri"/>
               </w:rPr>
-              <w:t>(</w:t>
-            </w:r>
-            <w:proofErr w:type="spellStart"/>
-            <w:proofErr w:type="gramStart"/>
-            <w:r>
-              <w:rPr>
-                <w:rFonts w:ascii="Calibri" w:hAnsi="Calibri" w:cs="Calibri"/>
-              </w:rPr>
-              <w:t>д,д</w:t>
-            </w:r>
-            <w:proofErr w:type="spellEnd"/>
-            <w:proofErr w:type="gramEnd"/>
-            <w:r>
-              <w:rPr>
-                <w:rFonts w:ascii="Calibri" w:hAnsi="Calibri" w:cs="Calibri"/>
-              </w:rPr>
-              <w:t>)</w:t>
+              <w:t>(д,д)</w:t>
             </w:r>
           </w:p>
         </w:tc>
@@ -10814,8 +10739,6 @@
             <w:r>
               <w:t>(</w:t>
             </w:r>
-            <w:proofErr w:type="spellStart"/>
-            <w:proofErr w:type="gramStart"/>
             <w:r>
               <w:rPr>
                 <w:rFonts w:ascii="Calibri" w:hAnsi="Calibri" w:cs="Calibri"/>
@@ -10831,8 +10754,6 @@
               </w:rPr>
               <w:t>б</w:t>
             </w:r>
-            <w:proofErr w:type="spellEnd"/>
-            <w:proofErr w:type="gramEnd"/>
             <w:r>
               <w:t>)</w:t>
             </w:r>
@@ -10853,23 +10774,7 @@
               <w:rPr>
                 <w:rFonts w:ascii="Calibri" w:hAnsi="Calibri" w:cs="Calibri"/>
               </w:rPr>
-              <w:t>(</w:t>
-            </w:r>
-            <w:proofErr w:type="spellStart"/>
-            <w:proofErr w:type="gramStart"/>
-            <w:r>
-              <w:rPr>
-                <w:rFonts w:ascii="Calibri" w:hAnsi="Calibri" w:cs="Calibri"/>
-              </w:rPr>
-              <w:t>б,д</w:t>
-            </w:r>
-            <w:proofErr w:type="spellEnd"/>
-            <w:proofErr w:type="gramEnd"/>
-            <w:r>
-              <w:rPr>
-                <w:rFonts w:ascii="Calibri" w:hAnsi="Calibri" w:cs="Calibri"/>
-              </w:rPr>
-              <w:t>)</w:t>
+              <w:t>(б,д)</w:t>
             </w:r>
           </w:p>
         </w:tc>
@@ -10885,25 +10790,21 @@
                 <w:lang w:val="ce-Cyrl-RU"/>
               </w:rPr>
             </w:pPr>
-            <w:proofErr w:type="spellStart"/>
             <w:r>
               <w:rPr>
                 <w:rFonts w:ascii="Calibri" w:hAnsi="Calibri" w:cs="Calibri"/>
               </w:rPr>
               <w:t>Единственное</w:t>
             </w:r>
-            <w:proofErr w:type="spellEnd"/>
             <w:r>
               <w:t xml:space="preserve"> </w:t>
             </w:r>
-            <w:proofErr w:type="spellStart"/>
             <w:r>
               <w:rPr>
                 <w:rFonts w:ascii="Calibri" w:hAnsi="Calibri" w:cs="Calibri"/>
               </w:rPr>
               <w:t>число</w:t>
             </w:r>
-            <w:proofErr w:type="spellEnd"/>
           </w:p>
         </w:tc>
         <w:tc>
@@ -10919,7 +10820,6 @@
                 <w:lang w:val="ce-Cyrl-RU"/>
               </w:rPr>
             </w:pPr>
-            <w:proofErr w:type="spellStart"/>
             <w:r>
               <w:rPr>
                 <w:rFonts w:ascii="Calibri" w:hAnsi="Calibri" w:cs="Calibri"/>
@@ -10928,7 +10828,6 @@
               </w:rPr>
               <w:t>Да</w:t>
             </w:r>
-            <w:proofErr w:type="spellEnd"/>
           </w:p>
         </w:tc>
         <w:tc>
@@ -10944,7 +10843,6 @@
                 <w:lang w:val="ce-Cyrl-RU"/>
               </w:rPr>
             </w:pPr>
-            <w:proofErr w:type="spellStart"/>
             <w:r>
               <w:rPr>
                 <w:rFonts w:ascii="Calibri" w:hAnsi="Calibri" w:cs="Calibri"/>
@@ -10953,7 +10851,6 @@
               </w:rPr>
               <w:t>Нана</w:t>
             </w:r>
-            <w:proofErr w:type="spellEnd"/>
           </w:p>
         </w:tc>
         <w:tc>
@@ -10969,7 +10866,6 @@
                 <w:lang w:val="ce-Cyrl-RU"/>
               </w:rPr>
             </w:pPr>
-            <w:proofErr w:type="spellStart"/>
             <w:r>
               <w:rPr>
                 <w:rFonts w:ascii="Calibri" w:hAnsi="Calibri" w:cs="Calibri"/>
@@ -10978,7 +10874,6 @@
               </w:rPr>
               <w:t>Говр</w:t>
             </w:r>
-            <w:proofErr w:type="spellEnd"/>
           </w:p>
         </w:tc>
         <w:tc>
@@ -10994,7 +10889,6 @@
                 <w:lang w:val="ce-Cyrl-RU"/>
               </w:rPr>
             </w:pPr>
-            <w:proofErr w:type="spellStart"/>
             <w:r>
               <w:rPr>
                 <w:rFonts w:ascii="Calibri" w:hAnsi="Calibri" w:cs="Calibri"/>
@@ -11003,7 +10897,6 @@
               </w:rPr>
               <w:t>Бер</w:t>
             </w:r>
-            <w:proofErr w:type="spellEnd"/>
           </w:p>
         </w:tc>
         <w:tc>
@@ -11019,7 +10912,6 @@
                 <w:lang w:val="ce-Cyrl-RU"/>
               </w:rPr>
             </w:pPr>
-            <w:proofErr w:type="spellStart"/>
             <w:r>
               <w:rPr>
                 <w:i/>
@@ -11035,7 +10927,6 @@
               </w:rPr>
               <w:t>аж</w:t>
             </w:r>
-            <w:proofErr w:type="spellEnd"/>
           </w:p>
         </w:tc>
         <w:tc>
@@ -11051,7 +10942,6 @@
                 <w:lang w:val="ce-Cyrl-RU"/>
               </w:rPr>
             </w:pPr>
-            <w:proofErr w:type="spellStart"/>
             <w:r>
               <w:rPr>
                 <w:rFonts w:ascii="Calibri" w:hAnsi="Calibri" w:cs="Calibri"/>
@@ -11060,7 +10950,6 @@
               </w:rPr>
               <w:t>Маьнги</w:t>
             </w:r>
-            <w:proofErr w:type="spellEnd"/>
           </w:p>
         </w:tc>
       </w:tr>
@@ -11087,25 +10976,21 @@
             <w:r>
               <w:t xml:space="preserve"> </w:t>
             </w:r>
-            <w:proofErr w:type="spellStart"/>
             <w:r>
               <w:rPr>
                 <w:rFonts w:ascii="Calibri" w:hAnsi="Calibri" w:cs="Calibri"/>
               </w:rPr>
               <w:t>лицо</w:t>
             </w:r>
-            <w:proofErr w:type="spellEnd"/>
             <w:r>
               <w:t xml:space="preserve"> (</w:t>
             </w:r>
-            <w:proofErr w:type="spellStart"/>
             <w:r>
               <w:rPr>
                 <w:rFonts w:ascii="Calibri" w:hAnsi="Calibri" w:cs="Calibri"/>
               </w:rPr>
               <w:t>Со</w:t>
             </w:r>
-            <w:proofErr w:type="spellEnd"/>
             <w:r>
               <w:t>)</w:t>
             </w:r>
@@ -11123,16 +11008,12 @@
                 <w:lang w:val="ce-Cyrl-RU"/>
               </w:rPr>
             </w:pPr>
-            <w:proofErr w:type="spellStart"/>
-            <w:proofErr w:type="gramStart"/>
             <w:r>
               <w:rPr>
                 <w:rFonts w:ascii="Calibri" w:hAnsi="Calibri" w:cs="Calibri"/>
               </w:rPr>
               <w:t>ва</w:t>
             </w:r>
-            <w:proofErr w:type="spellEnd"/>
-            <w:proofErr w:type="gramEnd"/>
           </w:p>
         </w:tc>
         <w:tc>
@@ -11147,16 +11028,12 @@
                 <w:lang w:val="ce-Cyrl-RU"/>
               </w:rPr>
             </w:pPr>
-            <w:proofErr w:type="spellStart"/>
-            <w:proofErr w:type="gramStart"/>
             <w:r>
               <w:rPr>
                 <w:rFonts w:ascii="Calibri" w:hAnsi="Calibri" w:cs="Calibri"/>
               </w:rPr>
               <w:t>йа</w:t>
             </w:r>
-            <w:proofErr w:type="spellEnd"/>
-            <w:proofErr w:type="gramEnd"/>
           </w:p>
         </w:tc>
         <w:tc>
@@ -11171,16 +11048,12 @@
                 <w:lang w:val="ce-Cyrl-RU"/>
               </w:rPr>
             </w:pPr>
-            <w:proofErr w:type="spellStart"/>
-            <w:proofErr w:type="gramStart"/>
             <w:r>
               <w:rPr>
                 <w:rFonts w:ascii="Calibri" w:hAnsi="Calibri" w:cs="Calibri"/>
               </w:rPr>
               <w:t>йа</w:t>
             </w:r>
-            <w:proofErr w:type="spellEnd"/>
-            <w:proofErr w:type="gramEnd"/>
           </w:p>
         </w:tc>
         <w:tc>
@@ -11195,16 +11068,12 @@
                 <w:lang w:val="ce-Cyrl-RU"/>
               </w:rPr>
             </w:pPr>
-            <w:proofErr w:type="spellStart"/>
-            <w:proofErr w:type="gramStart"/>
             <w:r>
               <w:rPr>
                 <w:rFonts w:ascii="Calibri" w:hAnsi="Calibri" w:cs="Calibri"/>
               </w:rPr>
               <w:t>да</w:t>
             </w:r>
-            <w:proofErr w:type="spellEnd"/>
-            <w:proofErr w:type="gramEnd"/>
           </w:p>
         </w:tc>
         <w:tc>
@@ -11219,16 +11088,12 @@
                 <w:lang w:val="ce-Cyrl-RU"/>
               </w:rPr>
             </w:pPr>
-            <w:proofErr w:type="spellStart"/>
-            <w:proofErr w:type="gramStart"/>
             <w:r>
               <w:rPr>
                 <w:rFonts w:ascii="Calibri" w:hAnsi="Calibri" w:cs="Calibri"/>
               </w:rPr>
               <w:t>ба</w:t>
             </w:r>
-            <w:proofErr w:type="spellEnd"/>
-            <w:proofErr w:type="gramEnd"/>
           </w:p>
         </w:tc>
         <w:tc>
@@ -11243,16 +11108,12 @@
                 <w:lang w:val="ce-Cyrl-RU"/>
               </w:rPr>
             </w:pPr>
-            <w:proofErr w:type="spellStart"/>
-            <w:proofErr w:type="gramStart"/>
             <w:r>
               <w:rPr>
                 <w:rFonts w:ascii="Calibri" w:hAnsi="Calibri" w:cs="Calibri"/>
               </w:rPr>
               <w:t>ба</w:t>
             </w:r>
-            <w:proofErr w:type="spellEnd"/>
-            <w:proofErr w:type="gramEnd"/>
           </w:p>
           <w:p>
             <w:pPr>
@@ -11287,25 +11148,21 @@
             <w:r>
               <w:t xml:space="preserve"> </w:t>
             </w:r>
-            <w:proofErr w:type="spellStart"/>
             <w:r>
               <w:rPr>
                 <w:rFonts w:ascii="Calibri" w:hAnsi="Calibri" w:cs="Calibri"/>
               </w:rPr>
               <w:t>лицо</w:t>
             </w:r>
-            <w:proofErr w:type="spellEnd"/>
             <w:r>
               <w:t xml:space="preserve"> (</w:t>
             </w:r>
-            <w:proofErr w:type="spellStart"/>
             <w:r>
               <w:rPr>
                 <w:rFonts w:ascii="Calibri" w:hAnsi="Calibri" w:cs="Calibri"/>
               </w:rPr>
               <w:t>Хьо</w:t>
             </w:r>
-            <w:proofErr w:type="spellEnd"/>
             <w:r>
               <w:t>)</w:t>
             </w:r>
@@ -11413,25 +11270,21 @@
             <w:r>
               <w:t xml:space="preserve"> </w:t>
             </w:r>
-            <w:proofErr w:type="spellStart"/>
             <w:r>
               <w:rPr>
                 <w:rFonts w:ascii="Calibri" w:hAnsi="Calibri" w:cs="Calibri"/>
               </w:rPr>
               <w:t>лицо</w:t>
             </w:r>
-            <w:proofErr w:type="spellEnd"/>
             <w:r>
               <w:t xml:space="preserve"> (</w:t>
             </w:r>
-            <w:proofErr w:type="spellStart"/>
             <w:r>
               <w:rPr>
                 <w:rFonts w:ascii="Calibri" w:hAnsi="Calibri" w:cs="Calibri"/>
               </w:rPr>
               <w:t>Из</w:t>
             </w:r>
-            <w:proofErr w:type="spellEnd"/>
             <w:r>
               <w:t>)</w:t>
             </w:r>
@@ -11527,25 +11380,21 @@
                 <w:lang w:val="ce-Cyrl-RU"/>
               </w:rPr>
             </w:pPr>
-            <w:proofErr w:type="spellStart"/>
             <w:r>
               <w:rPr>
                 <w:rFonts w:ascii="Calibri" w:hAnsi="Calibri" w:cs="Calibri"/>
               </w:rPr>
               <w:t>Множественное</w:t>
             </w:r>
-            <w:proofErr w:type="spellEnd"/>
             <w:r>
               <w:t xml:space="preserve"> </w:t>
             </w:r>
-            <w:proofErr w:type="spellStart"/>
             <w:r>
               <w:rPr>
                 <w:rFonts w:ascii="Calibri" w:hAnsi="Calibri" w:cs="Calibri"/>
               </w:rPr>
               <w:t>число</w:t>
             </w:r>
-            <w:proofErr w:type="spellEnd"/>
           </w:p>
         </w:tc>
         <w:tc>
@@ -11561,7 +11410,6 @@
                 <w:lang w:val="ce-Cyrl-RU"/>
               </w:rPr>
             </w:pPr>
-            <w:proofErr w:type="spellStart"/>
             <w:r>
               <w:rPr>
                 <w:rFonts w:ascii="Calibri" w:hAnsi="Calibri" w:cs="Calibri"/>
@@ -11570,7 +11418,6 @@
               </w:rPr>
               <w:t>Даьй</w:t>
             </w:r>
-            <w:proofErr w:type="spellEnd"/>
           </w:p>
         </w:tc>
         <w:tc>
@@ -11586,7 +11433,6 @@
                 <w:lang w:val="ce-Cyrl-RU"/>
               </w:rPr>
             </w:pPr>
-            <w:proofErr w:type="spellStart"/>
             <w:r>
               <w:rPr>
                 <w:rFonts w:ascii="Calibri" w:hAnsi="Calibri" w:cs="Calibri"/>
@@ -11595,7 +11441,6 @@
               </w:rPr>
               <w:t>Наной</w:t>
             </w:r>
-            <w:proofErr w:type="spellEnd"/>
           </w:p>
         </w:tc>
         <w:tc>
@@ -11610,7 +11455,6 @@
                 <w:lang w:val="ce-Cyrl-RU"/>
               </w:rPr>
             </w:pPr>
-            <w:proofErr w:type="spellStart"/>
             <w:r>
               <w:rPr>
                 <w:rFonts w:ascii="Calibri" w:hAnsi="Calibri" w:cs="Calibri"/>
@@ -11619,7 +11463,6 @@
               </w:rPr>
               <w:t>Говраш</w:t>
             </w:r>
-            <w:proofErr w:type="spellEnd"/>
           </w:p>
         </w:tc>
         <w:tc>
@@ -11634,7 +11477,6 @@
                 <w:lang w:val="ce-Cyrl-RU"/>
               </w:rPr>
             </w:pPr>
-            <w:proofErr w:type="spellStart"/>
             <w:r>
               <w:rPr>
                 <w:rFonts w:ascii="Calibri" w:hAnsi="Calibri" w:cs="Calibri"/>
@@ -11643,7 +11485,6 @@
               </w:rPr>
               <w:t>Бераш</w:t>
             </w:r>
-            <w:proofErr w:type="spellEnd"/>
           </w:p>
         </w:tc>
         <w:tc>
@@ -11658,7 +11499,6 @@
                 <w:lang w:val="ce-Cyrl-RU"/>
               </w:rPr>
             </w:pPr>
-            <w:proofErr w:type="spellStart"/>
             <w:r>
               <w:rPr>
                 <w:i/>
@@ -11674,7 +11514,6 @@
               </w:rPr>
               <w:t>ажаш</w:t>
             </w:r>
-            <w:proofErr w:type="spellEnd"/>
           </w:p>
         </w:tc>
         <w:tc>
@@ -11689,7 +11528,6 @@
                 <w:lang w:val="ce-Cyrl-RU"/>
               </w:rPr>
             </w:pPr>
-            <w:proofErr w:type="spellStart"/>
             <w:r>
               <w:rPr>
                 <w:rFonts w:ascii="Calibri" w:hAnsi="Calibri" w:cs="Calibri"/>
@@ -11698,7 +11536,6 @@
               </w:rPr>
               <w:t>Маьнгеш</w:t>
             </w:r>
-            <w:proofErr w:type="spellEnd"/>
           </w:p>
         </w:tc>
       </w:tr>
@@ -11725,36 +11562,30 @@
             <w:r>
               <w:t xml:space="preserve"> </w:t>
             </w:r>
-            <w:proofErr w:type="spellStart"/>
             <w:r>
               <w:rPr>
                 <w:rFonts w:ascii="Calibri" w:hAnsi="Calibri" w:cs="Calibri"/>
               </w:rPr>
               <w:t>лицо</w:t>
             </w:r>
-            <w:proofErr w:type="spellEnd"/>
             <w:r>
               <w:t xml:space="preserve"> (</w:t>
             </w:r>
-            <w:proofErr w:type="spellStart"/>
             <w:r>
               <w:rPr>
                 <w:rFonts w:ascii="Calibri" w:hAnsi="Calibri" w:cs="Calibri"/>
               </w:rPr>
               <w:t>Вай</w:t>
             </w:r>
-            <w:proofErr w:type="spellEnd"/>
             <w:r>
               <w:t xml:space="preserve">, </w:t>
             </w:r>
-            <w:proofErr w:type="spellStart"/>
             <w:r>
               <w:rPr>
                 <w:rFonts w:ascii="Calibri" w:hAnsi="Calibri" w:cs="Calibri"/>
               </w:rPr>
               <w:t>Тхо</w:t>
             </w:r>
-            <w:proofErr w:type="spellEnd"/>
             <w:r>
               <w:t>)</w:t>
             </w:r>
@@ -11772,16 +11603,12 @@
                 <w:lang w:val="ce-Cyrl-RU"/>
               </w:rPr>
             </w:pPr>
-            <w:proofErr w:type="spellStart"/>
-            <w:proofErr w:type="gramStart"/>
             <w:r>
               <w:rPr>
                 <w:rFonts w:ascii="Calibri" w:hAnsi="Calibri" w:cs="Calibri"/>
               </w:rPr>
               <w:t>да</w:t>
             </w:r>
-            <w:proofErr w:type="spellEnd"/>
-            <w:proofErr w:type="gramEnd"/>
           </w:p>
         </w:tc>
         <w:tc>
@@ -11796,16 +11623,12 @@
                 <w:lang w:val="ce-Cyrl-RU"/>
               </w:rPr>
             </w:pPr>
-            <w:proofErr w:type="spellStart"/>
-            <w:proofErr w:type="gramStart"/>
             <w:r>
               <w:rPr>
                 <w:rFonts w:ascii="Calibri" w:hAnsi="Calibri" w:cs="Calibri"/>
               </w:rPr>
               <w:t>да</w:t>
             </w:r>
-            <w:proofErr w:type="spellEnd"/>
-            <w:proofErr w:type="gramEnd"/>
           </w:p>
         </w:tc>
         <w:tc>
@@ -11820,16 +11643,12 @@
                 <w:lang w:val="ce-Cyrl-RU"/>
               </w:rPr>
             </w:pPr>
-            <w:proofErr w:type="spellStart"/>
-            <w:proofErr w:type="gramStart"/>
             <w:r>
               <w:rPr>
                 <w:rFonts w:ascii="Calibri" w:hAnsi="Calibri" w:cs="Calibri"/>
               </w:rPr>
               <w:t>йа</w:t>
             </w:r>
-            <w:proofErr w:type="spellEnd"/>
-            <w:proofErr w:type="gramEnd"/>
           </w:p>
         </w:tc>
         <w:tc>
@@ -11844,16 +11663,12 @@
                 <w:lang w:val="ce-Cyrl-RU"/>
               </w:rPr>
             </w:pPr>
-            <w:proofErr w:type="spellStart"/>
-            <w:proofErr w:type="gramStart"/>
             <w:r>
               <w:rPr>
                 <w:rFonts w:ascii="Calibri" w:hAnsi="Calibri" w:cs="Calibri"/>
               </w:rPr>
               <w:t>да</w:t>
             </w:r>
-            <w:proofErr w:type="spellEnd"/>
-            <w:proofErr w:type="gramEnd"/>
           </w:p>
         </w:tc>
         <w:tc>
@@ -11868,16 +11683,12 @@
                 <w:lang w:val="ce-Cyrl-RU"/>
               </w:rPr>
             </w:pPr>
-            <w:proofErr w:type="spellStart"/>
-            <w:proofErr w:type="gramStart"/>
             <w:r>
               <w:rPr>
                 <w:rFonts w:ascii="Calibri" w:hAnsi="Calibri" w:cs="Calibri"/>
               </w:rPr>
               <w:t>ба</w:t>
             </w:r>
-            <w:proofErr w:type="spellEnd"/>
-            <w:proofErr w:type="gramEnd"/>
           </w:p>
         </w:tc>
         <w:tc>
@@ -11892,16 +11703,12 @@
                 <w:lang w:val="ce-Cyrl-RU"/>
               </w:rPr>
             </w:pPr>
-            <w:proofErr w:type="spellStart"/>
-            <w:proofErr w:type="gramStart"/>
             <w:r>
               <w:rPr>
                 <w:rFonts w:ascii="Calibri" w:hAnsi="Calibri" w:cs="Calibri"/>
               </w:rPr>
               <w:t>да</w:t>
             </w:r>
-            <w:proofErr w:type="spellEnd"/>
-            <w:proofErr w:type="gramEnd"/>
           </w:p>
           <w:p>
             <w:pPr>
@@ -11936,25 +11743,21 @@
             <w:r>
               <w:t xml:space="preserve"> </w:t>
             </w:r>
-            <w:proofErr w:type="spellStart"/>
             <w:r>
               <w:rPr>
                 <w:rFonts w:ascii="Calibri" w:hAnsi="Calibri" w:cs="Calibri"/>
               </w:rPr>
               <w:t>лицо</w:t>
             </w:r>
-            <w:proofErr w:type="spellEnd"/>
             <w:r>
               <w:t xml:space="preserve"> (</w:t>
             </w:r>
-            <w:proofErr w:type="spellStart"/>
             <w:r>
               <w:rPr>
                 <w:rFonts w:ascii="Calibri" w:hAnsi="Calibri" w:cs="Calibri"/>
               </w:rPr>
               <w:t>Шу</w:t>
             </w:r>
-            <w:proofErr w:type="spellEnd"/>
             <w:r>
               <w:t>)</w:t>
             </w:r>
@@ -12064,36 +11867,30 @@
             <w:r>
               <w:t xml:space="preserve"> </w:t>
             </w:r>
-            <w:proofErr w:type="spellStart"/>
             <w:r>
               <w:rPr>
                 <w:rFonts w:ascii="Calibri" w:hAnsi="Calibri" w:cs="Calibri"/>
               </w:rPr>
               <w:t>лицо</w:t>
             </w:r>
-            <w:proofErr w:type="spellEnd"/>
             <w:r>
               <w:t xml:space="preserve"> (</w:t>
             </w:r>
-            <w:proofErr w:type="spellStart"/>
             <w:r>
               <w:rPr>
                 <w:rFonts w:ascii="Calibri" w:hAnsi="Calibri" w:cs="Calibri"/>
               </w:rPr>
               <w:t>Уж</w:t>
             </w:r>
-            <w:proofErr w:type="spellEnd"/>
             <w:r>
               <w:t xml:space="preserve">, </w:t>
             </w:r>
-            <w:proofErr w:type="spellStart"/>
             <w:r>
               <w:rPr>
                 <w:rFonts w:ascii="Calibri" w:hAnsi="Calibri" w:cs="Calibri"/>
               </w:rPr>
               <w:t>Ужаш</w:t>
             </w:r>
-            <w:proofErr w:type="spellEnd"/>
             <w:r>
               <w:t>)</w:t>
             </w:r>
@@ -12110,16 +11907,12 @@
                 <w:lang w:val="ce-Cyrl-RU"/>
               </w:rPr>
             </w:pPr>
-            <w:proofErr w:type="spellStart"/>
-            <w:proofErr w:type="gramStart"/>
             <w:r>
               <w:rPr>
                 <w:rFonts w:ascii="Calibri" w:hAnsi="Calibri" w:cs="Calibri"/>
               </w:rPr>
               <w:t>ба</w:t>
             </w:r>
-            <w:proofErr w:type="spellEnd"/>
-            <w:proofErr w:type="gramEnd"/>
           </w:p>
         </w:tc>
         <w:tc>
@@ -12133,16 +11926,12 @@
                 <w:lang w:val="ce-Cyrl-RU"/>
               </w:rPr>
             </w:pPr>
-            <w:proofErr w:type="spellStart"/>
-            <w:proofErr w:type="gramStart"/>
             <w:r>
               <w:rPr>
                 <w:rFonts w:ascii="Calibri" w:hAnsi="Calibri" w:cs="Calibri"/>
               </w:rPr>
               <w:t>ба</w:t>
             </w:r>
-            <w:proofErr w:type="spellEnd"/>
-            <w:proofErr w:type="gramEnd"/>
           </w:p>
         </w:tc>
         <w:tc>
@@ -19979,7 +19768,21 @@
           <w:rFonts w:ascii="Calibri" w:hAnsi="Calibri" w:cs="Calibri"/>
           <w:lang w:val="ce-Cyrl-RU"/>
         </w:rPr>
-        <w:t>Части речи</w:t>
+        <w:t>Терминология - ч</w:t>
+      </w:r>
+      <w:r>
+        <w:rPr>
+          <w:rFonts w:ascii="Calibri" w:hAnsi="Calibri" w:cs="Calibri"/>
+          <w:lang w:val="ce-Cyrl-RU"/>
+        </w:rPr>
+        <w:t>асти речи</w:t>
+      </w:r>
+      <w:r>
+        <w:rPr>
+          <w:rFonts w:ascii="Calibri" w:hAnsi="Calibri" w:cs="Calibri"/>
+          <w:lang w:val="ce-Cyrl-RU"/>
+        </w:rPr>
+        <w:t xml:space="preserve"> и части слов.</w:t>
       </w:r>
     </w:p>
     <w:p>
@@ -19994,35 +19797,7 @@
           <w:rFonts w:ascii="Calibri" w:hAnsi="Calibri" w:cs="Calibri"/>
           <w:lang w:val="ce-Cyrl-RU"/>
         </w:rPr>
-        <w:t>TODO</w:t>
-      </w:r>
-      <w:r>
-        <w:rPr>
-          <w:rFonts w:ascii="Calibri" w:hAnsi="Calibri" w:cs="Calibri"/>
-          <w:lang w:val="ce-Cyrl-RU"/>
-        </w:rPr>
-        <w:t xml:space="preserve"> перенести перечисление (</w:t>
-      </w:r>
-      <w:r>
-        <w:rPr>
-          <w:rFonts w:ascii="Calibri" w:hAnsi="Calibri" w:cs="Calibri"/>
-          <w:lang w:val="ce-Cyrl-RU"/>
-        </w:rPr>
-        <w:t xml:space="preserve">Мальсагов, </w:t>
-      </w:r>
-      <w:r>
-        <w:rPr>
-          <w:rFonts w:ascii="Calibri" w:hAnsi="Calibri" w:cs="Calibri"/>
-          <w:lang w:val="ce-Cyrl-RU"/>
-        </w:rPr>
-        <w:t>стр. 75</w:t>
-      </w:r>
-      <w:r>
-        <w:rPr>
-          <w:rFonts w:ascii="Calibri" w:hAnsi="Calibri" w:cs="Calibri"/>
-          <w:lang w:val="ce-Cyrl-RU"/>
-        </w:rPr>
-        <w:t>) куда-нибудь подальше, ближе к середине</w:t>
+        <w:t>Слова могут изменяться по:</w:t>
       </w:r>
       <w:r>
         <w:rPr>
@@ -20030,13 +19805,14 @@
           <w:lang w:val="ce-Cyrl-RU"/>
         </w:rPr>
         <w:br/>
-      </w:r>
-      <w:r>
-        <w:rPr>
-          <w:rFonts w:ascii="Calibri" w:hAnsi="Calibri" w:cs="Calibri"/>
-          <w:lang w:val="ce-Cyrl-RU"/>
-        </w:rPr>
-        <w:t>Слова могут изменяться по:</w:t>
+        <w:t>- падежам (склоняться)</w:t>
+      </w:r>
+      <w:r>
+        <w:rPr>
+          <w:rFonts w:ascii="Calibri" w:hAnsi="Calibri" w:cs="Calibri"/>
+          <w:lang w:val="ce-Cyrl-RU"/>
+        </w:rPr>
+        <w:t>, сирг1а – сирг1ах</w:t>
       </w:r>
       <w:r>
         <w:rPr>
@@ -20044,7 +19820,14 @@
           <w:lang w:val="ce-Cyrl-RU"/>
         </w:rPr>
         <w:br/>
-        <w:t>- падежам (склоняться);</w:t>
+        <w:t>- временам (спрягаться)</w:t>
+      </w:r>
+      <w:r>
+        <w:rPr>
+          <w:rFonts w:ascii="Calibri" w:hAnsi="Calibri" w:cs="Calibri"/>
+          <w:lang w:val="ce-Cyrl-RU"/>
+        </w:rPr>
+        <w:t>, ала – аьннад;</w:t>
       </w:r>
       <w:r>
         <w:rPr>
@@ -20052,15 +19835,14 @@
           <w:lang w:val="ce-Cyrl-RU"/>
         </w:rPr>
         <w:br/>
-        <w:t>- временам (спрягаться);</w:t>
-      </w:r>
-      <w:r>
-        <w:rPr>
-          <w:rFonts w:ascii="Calibri" w:hAnsi="Calibri" w:cs="Calibri"/>
-          <w:lang w:val="ce-Cyrl-RU"/>
-        </w:rPr>
-        <w:br/>
-        <w:t>- по числам;</w:t>
+        <w:t>- по числам</w:t>
+      </w:r>
+      <w:r>
+        <w:rPr>
+          <w:rFonts w:ascii="Calibri" w:hAnsi="Calibri" w:cs="Calibri"/>
+          <w:lang w:val="ce-Cyrl-RU"/>
+        </w:rPr>
+        <w:t>, оалхазар – оалхазараш;</w:t>
       </w:r>
       <w:r>
         <w:rPr>
@@ -20075,8 +19857,22 @@
           <w:rFonts w:ascii="Calibri" w:hAnsi="Calibri" w:cs="Calibri"/>
           <w:lang w:val="ce-Cyrl-RU"/>
         </w:rPr>
+        <w:t xml:space="preserve"> дика – дикаг1а;</w:t>
+      </w:r>
+      <w:r>
+        <w:rPr>
+          <w:rFonts w:ascii="Calibri" w:hAnsi="Calibri" w:cs="Calibri"/>
+          <w:lang w:val="ce-Cyrl-RU"/>
+        </w:rPr>
         <w:br/>
-        <w:t>- по классам;</w:t>
+        <w:t>- по классам</w:t>
+      </w:r>
+      <w:r>
+        <w:rPr>
+          <w:rFonts w:ascii="Calibri" w:hAnsi="Calibri" w:cs="Calibri"/>
+          <w:lang w:val="ce-Cyrl-RU"/>
+        </w:rPr>
+        <w:t>, д1адахийтад – д1айахийтад;</w:t>
       </w:r>
       <w:r>
         <w:rPr>
@@ -20092,7 +19888,30 @@
           <w:lang w:val="ce-Cyrl-RU"/>
         </w:rPr>
         <w:br/>
-        <w:t>- существительное (ц1араш);</w:t>
+        <w:t>- существительное</w:t>
+      </w:r>
+      <w:r>
+        <w:rPr>
+          <w:rFonts w:ascii="Calibri" w:hAnsi="Calibri" w:cs="Calibri"/>
+          <w:lang w:val="ce-Cyrl-RU"/>
+        </w:rPr>
+        <w:t xml:space="preserve">, </w:t>
+      </w:r>
+      <w:r>
+        <w:rPr>
+          <w:rFonts w:ascii="Calibri" w:hAnsi="Calibri" w:cs="Calibri"/>
+          <w:i/>
+          <w:iCs/>
+          <w:lang w:val="ce-Cyrl-RU"/>
+        </w:rPr>
+        <w:t>ц1алг</w:t>
+      </w:r>
+      <w:r>
+        <w:rPr>
+          <w:rFonts w:ascii="Calibri" w:hAnsi="Calibri" w:cs="Calibri"/>
+          <w:lang w:val="ce-Cyrl-RU"/>
+        </w:rPr>
+        <w:t>;</w:t>
       </w:r>
       <w:r>
         <w:rPr>
@@ -20100,7 +19919,30 @@
           <w:lang w:val="ce-Cyrl-RU"/>
         </w:rPr>
         <w:br/>
-        <w:t>- прилагательное (белгалонаш);</w:t>
+        <w:t>- прилагательное</w:t>
+      </w:r>
+      <w:r>
+        <w:rPr>
+          <w:rFonts w:ascii="Calibri" w:hAnsi="Calibri" w:cs="Calibri"/>
+          <w:lang w:val="ce-Cyrl-RU"/>
+        </w:rPr>
+        <w:t xml:space="preserve">, </w:t>
+      </w:r>
+      <w:r>
+        <w:rPr>
+          <w:rFonts w:ascii="Calibri" w:hAnsi="Calibri" w:cs="Calibri"/>
+          <w:i/>
+          <w:iCs/>
+          <w:lang w:val="ce-Cyrl-RU"/>
+        </w:rPr>
+        <w:t>аьшка</w:t>
+      </w:r>
+      <w:r>
+        <w:rPr>
+          <w:rFonts w:ascii="Calibri" w:hAnsi="Calibri" w:cs="Calibri"/>
+          <w:lang w:val="ce-Cyrl-RU"/>
+        </w:rPr>
+        <w:t>;</w:t>
       </w:r>
       <w:r>
         <w:rPr>
@@ -20108,7 +19950,30 @@
           <w:lang w:val="ce-Cyrl-RU"/>
         </w:rPr>
         <w:br/>
-        <w:t>- числительное (таьрг1аш);</w:t>
+        <w:t>- числительное</w:t>
+      </w:r>
+      <w:r>
+        <w:rPr>
+          <w:rFonts w:ascii="Calibri" w:hAnsi="Calibri" w:cs="Calibri"/>
+          <w:lang w:val="ce-Cyrl-RU"/>
+        </w:rPr>
+        <w:t xml:space="preserve"> - </w:t>
+      </w:r>
+      <w:r>
+        <w:rPr>
+          <w:rFonts w:ascii="Calibri" w:hAnsi="Calibri" w:cs="Calibri"/>
+          <w:i/>
+          <w:iCs/>
+          <w:lang w:val="ce-Cyrl-RU"/>
+        </w:rPr>
+        <w:t>шиъ</w:t>
+      </w:r>
+      <w:r>
+        <w:rPr>
+          <w:rFonts w:ascii="Calibri" w:hAnsi="Calibri" w:cs="Calibri"/>
+          <w:lang w:val="ce-Cyrl-RU"/>
+        </w:rPr>
+        <w:t>;</w:t>
       </w:r>
       <w:r>
         <w:rPr>
@@ -20116,7 +19981,30 @@
           <w:lang w:val="ce-Cyrl-RU"/>
         </w:rPr>
         <w:br/>
-        <w:t>- местоимение (ц1араметта);</w:t>
+        <w:t>- местоимение</w:t>
+      </w:r>
+      <w:r>
+        <w:rPr>
+          <w:rFonts w:ascii="Calibri" w:hAnsi="Calibri" w:cs="Calibri"/>
+          <w:lang w:val="ce-Cyrl-RU"/>
+        </w:rPr>
+        <w:t xml:space="preserve"> - </w:t>
+      </w:r>
+      <w:r>
+        <w:rPr>
+          <w:rFonts w:ascii="Calibri" w:hAnsi="Calibri" w:cs="Calibri"/>
+          <w:i/>
+          <w:iCs/>
+          <w:lang w:val="ce-Cyrl-RU"/>
+        </w:rPr>
+        <w:t>хьо</w:t>
+      </w:r>
+      <w:r>
+        <w:rPr>
+          <w:rFonts w:ascii="Calibri" w:hAnsi="Calibri" w:cs="Calibri"/>
+          <w:lang w:val="ce-Cyrl-RU"/>
+        </w:rPr>
+        <w:t>;</w:t>
       </w:r>
       <w:r>
         <w:rPr>
@@ -20124,7 +20012,30 @@
           <w:lang w:val="ce-Cyrl-RU"/>
         </w:rPr>
         <w:br/>
-        <w:t>- глагол (оаламаш);</w:t>
+        <w:t>- глагол</w:t>
+      </w:r>
+      <w:r>
+        <w:rPr>
+          <w:rFonts w:ascii="Calibri" w:hAnsi="Calibri" w:cs="Calibri"/>
+          <w:lang w:val="ce-Cyrl-RU"/>
+        </w:rPr>
+        <w:t xml:space="preserve"> – </w:t>
+      </w:r>
+      <w:r>
+        <w:rPr>
+          <w:rFonts w:ascii="Calibri" w:hAnsi="Calibri" w:cs="Calibri"/>
+          <w:i/>
+          <w:iCs/>
+          <w:lang w:val="ce-Cyrl-RU"/>
+        </w:rPr>
+        <w:t>к1аьдъеннай</w:t>
+      </w:r>
+      <w:r>
+        <w:rPr>
+          <w:rFonts w:ascii="Calibri" w:hAnsi="Calibri" w:cs="Calibri"/>
+          <w:lang w:val="ce-Cyrl-RU"/>
+        </w:rPr>
+        <w:t>;</w:t>
       </w:r>
       <w:r>
         <w:rPr>
@@ -20132,6 +20043,71 @@
           <w:lang w:val="ce-Cyrl-RU"/>
         </w:rPr>
         <w:br/>
+        <w:t xml:space="preserve">- причастие </w:t>
+      </w:r>
+      <w:r>
+        <w:rPr>
+          <w:rFonts w:ascii="Calibri" w:hAnsi="Calibri" w:cs="Calibri"/>
+          <w:lang w:val="ce-Cyrl-RU"/>
+        </w:rPr>
+        <w:t>– т1адеттала</w:t>
+      </w:r>
+      <w:r>
+        <w:rPr>
+          <w:rFonts w:ascii="Calibri" w:hAnsi="Calibri" w:cs="Calibri"/>
+          <w:lang w:val="ce-Cyrl-RU"/>
+        </w:rPr>
+        <w:t>рг (бьющийся);</w:t>
+      </w:r>
+      <w:r>
+        <w:rPr>
+          <w:rFonts w:ascii="Calibri" w:hAnsi="Calibri" w:cs="Calibri"/>
+          <w:lang w:val="ce-Cyrl-RU"/>
+        </w:rPr>
+        <w:br/>
+        <w:t xml:space="preserve">- деепричастие - </w:t>
+      </w:r>
+      <w:r>
+        <w:rPr>
+          <w:rFonts w:ascii="Calibri" w:hAnsi="Calibri" w:cs="Calibri"/>
+          <w:lang w:val="ce-Cyrl-RU"/>
+        </w:rPr>
+        <w:t>оалаш</w:t>
+      </w:r>
+      <w:r>
+        <w:rPr>
+          <w:rFonts w:ascii="Calibri" w:hAnsi="Calibri" w:cs="Calibri"/>
+          <w:lang w:val="ce-Cyrl-RU"/>
+        </w:rPr>
+        <w:t xml:space="preserve"> (</w:t>
+      </w:r>
+      <w:r>
+        <w:rPr>
+          <w:rFonts w:ascii="Calibri" w:hAnsi="Calibri" w:cs="Calibri"/>
+          <w:lang w:val="ce-Cyrl-RU"/>
+        </w:rPr>
+        <w:t>говоря</w:t>
+      </w:r>
+      <w:r>
+        <w:rPr>
+          <w:rFonts w:ascii="Calibri" w:hAnsi="Calibri" w:cs="Calibri"/>
+          <w:lang w:val="ce-Cyrl-RU"/>
+        </w:rPr>
+        <w:t>)</w:t>
+      </w:r>
+      <w:r>
+        <w:rPr>
+          <w:rFonts w:ascii="Calibri" w:hAnsi="Calibri" w:cs="Calibri"/>
+          <w:lang w:val="ce-Cyrl-RU"/>
+        </w:rPr>
+        <w:t>;</w:t>
+      </w:r>
+      <w:r>
+        <w:rPr>
+          <w:rFonts w:ascii="Calibri" w:hAnsi="Calibri" w:cs="Calibri"/>
+          <w:lang w:val="ce-Cyrl-RU"/>
+        </w:rPr>
+        <w:br/>
       </w:r>
       <w:r>
         <w:rPr>
@@ -20146,7 +20122,21 @@
           <w:lang w:val="ce-Cyrl-RU"/>
         </w:rPr>
         <w:br/>
-        <w:t>- наречие (хьисап);</w:t>
+        <w:t>- наречие</w:t>
+      </w:r>
+      <w:r>
+        <w:rPr>
+          <w:rFonts w:ascii="Calibri" w:hAnsi="Calibri" w:cs="Calibri"/>
+          <w:lang w:val="ce-Cyrl-RU"/>
+        </w:rPr>
+        <w:t xml:space="preserve"> – т1аккха</w:t>
+      </w:r>
+      <w:r>
+        <w:rPr>
+          <w:rFonts w:ascii="Calibri" w:hAnsi="Calibri" w:cs="Calibri"/>
+          <w:lang w:val="ce-Cyrl-RU"/>
+        </w:rPr>
+        <w:t>;</w:t>
       </w:r>
       <w:r>
         <w:rPr>
@@ -20154,7 +20144,79 @@
           <w:lang w:val="ce-Cyrl-RU"/>
         </w:rPr>
         <w:br/>
-        <w:t>- послелоги (т1адеттарг);</w:t>
+        <w:t xml:space="preserve">- </w:t>
+      </w:r>
+      <w:r>
+        <w:rPr>
+          <w:rFonts w:ascii="Calibri" w:hAnsi="Calibri" w:cs="Calibri"/>
+          <w:lang w:val="ce-Cyrl-RU"/>
+        </w:rPr>
+        <w:t xml:space="preserve">предлоги, </w:t>
+      </w:r>
+      <w:r>
+        <w:rPr>
+          <w:rFonts w:ascii="Calibri" w:hAnsi="Calibri" w:cs="Calibri"/>
+          <w:lang w:val="ce-Cyrl-RU"/>
+        </w:rPr>
+        <w:t>послелоги</w:t>
+      </w:r>
+      <w:r>
+        <w:rPr>
+          <w:rFonts w:ascii="Calibri" w:hAnsi="Calibri" w:cs="Calibri"/>
+          <w:lang w:val="ce-Cyrl-RU"/>
+        </w:rPr>
+        <w:t xml:space="preserve"> </w:t>
+      </w:r>
+      <w:r>
+        <w:rPr>
+          <w:rFonts w:ascii="Calibri" w:hAnsi="Calibri" w:cs="Calibri"/>
+          <w:lang w:val="ce-Cyrl-RU"/>
+        </w:rPr>
+        <w:t>–</w:t>
+      </w:r>
+      <w:r>
+        <w:rPr>
+          <w:rFonts w:ascii="Calibri" w:hAnsi="Calibri" w:cs="Calibri"/>
+          <w:lang w:val="ce-Cyrl-RU"/>
+        </w:rPr>
+        <w:t xml:space="preserve"> </w:t>
+      </w:r>
+      <w:r>
+        <w:rPr>
+          <w:rFonts w:ascii="Calibri" w:hAnsi="Calibri" w:cs="Calibri"/>
+          <w:lang w:val="ce-Cyrl-RU"/>
+        </w:rPr>
+        <w:t xml:space="preserve">дуне </w:t>
+      </w:r>
+      <w:r>
+        <w:rPr>
+          <w:rFonts w:ascii="Calibri" w:hAnsi="Calibri" w:cs="Calibri"/>
+          <w:i/>
+          <w:iCs/>
+          <w:lang w:val="ce-Cyrl-RU"/>
+        </w:rPr>
+        <w:t>т1а</w:t>
+      </w:r>
+      <w:r>
+        <w:rPr>
+          <w:rFonts w:ascii="Calibri" w:hAnsi="Calibri" w:cs="Calibri"/>
+          <w:lang w:val="ce-Cyrl-RU"/>
+        </w:rPr>
+        <w:t>;</w:t>
+      </w:r>
+      <w:r>
+        <w:rPr>
+          <w:rFonts w:ascii="Calibri" w:hAnsi="Calibri" w:cs="Calibri"/>
+          <w:lang w:val="ce-Cyrl-RU"/>
+        </w:rPr>
+        <w:t xml:space="preserve"> </w:t>
+      </w:r>
+      <w:r>
+        <w:rPr>
+          <w:rFonts w:ascii="Calibri" w:hAnsi="Calibri" w:cs="Calibri"/>
+          <w:lang w:val="ce-Cyrl-RU"/>
+        </w:rPr>
+        <w:t>в ингушском нет предлогов, в русском нет послелогов.</w:t>
       </w:r>
       <w:r>
         <w:rPr>
@@ -20162,7 +20224,57 @@
           <w:lang w:val="ce-Cyrl-RU"/>
         </w:rPr>
         <w:br/>
-        <w:t>- союзы (хоттарг);</w:t>
+        <w:t xml:space="preserve">- союзы </w:t>
+      </w:r>
+      <w:r>
+        <w:rPr>
+          <w:rFonts w:ascii="Calibri" w:hAnsi="Calibri" w:cs="Calibri"/>
+          <w:lang w:val="ce-Cyrl-RU"/>
+        </w:rPr>
+        <w:t xml:space="preserve">- </w:t>
+      </w:r>
+      <w:r>
+        <w:rPr>
+          <w:rFonts w:ascii="Calibri" w:hAnsi="Calibri" w:cs="Calibri"/>
+          <w:lang w:val="ru-RU"/>
+        </w:rPr>
+        <w:t>доттаг</w:t>
+      </w:r>
+      <w:r>
+        <w:rPr>
+          <w:rFonts w:ascii="Calibri" w:hAnsi="Calibri" w:cs="Calibri"/>
+        </w:rPr>
+        <w:t>I</w:t>
+      </w:r>
+      <w:r>
+        <w:rPr>
+          <w:rFonts w:ascii="Calibri" w:hAnsi="Calibri" w:cs="Calibri"/>
+          <w:lang w:val="ru-RU"/>
+        </w:rPr>
+        <w:t>ал</w:t>
+      </w:r>
+      <w:r>
+        <w:rPr>
+          <w:rFonts w:ascii="Calibri" w:hAnsi="Calibri" w:cs="Calibri"/>
+          <w:i/>
+          <w:iCs/>
+          <w:lang w:val="ru-RU"/>
+        </w:rPr>
+        <w:t xml:space="preserve"> а</w:t>
+      </w:r>
+      <w:r>
+        <w:rPr>
+          <w:rFonts w:ascii="Calibri" w:hAnsi="Calibri" w:cs="Calibri"/>
+          <w:lang w:val="ru-RU"/>
+        </w:rPr>
+        <w:t xml:space="preserve"> тесса</w:t>
+      </w:r>
+      <w:r>
+        <w:rPr>
+          <w:rFonts w:ascii="Calibri" w:hAnsi="Calibri" w:cs="Calibri"/>
+          <w:lang w:val="ce-Cyrl-RU"/>
+        </w:rPr>
+        <w:t>;</w:t>
       </w:r>
     </w:p>
     <w:p>
@@ -20177,7 +20289,213 @@
           <w:rFonts w:ascii="Calibri" w:hAnsi="Calibri" w:cs="Calibri"/>
           <w:lang w:val="ce-Cyrl-RU"/>
         </w:rPr>
+        <w:t>Части слов (морфемы):</w:t>
+      </w:r>
+      <w:r>
+        <w:rPr>
+          <w:rFonts w:ascii="Calibri" w:hAnsi="Calibri" w:cs="Calibri"/>
+          <w:lang w:val="ce-Cyrl-RU"/>
+        </w:rPr>
+        <w:br/>
+        <w:t>- корень</w:t>
+      </w:r>
+      <w:r>
+        <w:rPr>
+          <w:rFonts w:ascii="Calibri" w:hAnsi="Calibri" w:cs="Calibri"/>
+          <w:lang w:val="ce-Cyrl-RU"/>
+        </w:rPr>
+        <w:t xml:space="preserve"> – часть, не подверженная изменениям</w:t>
+      </w:r>
+      <w:r>
+        <w:rPr>
+          <w:rFonts w:ascii="Calibri" w:hAnsi="Calibri" w:cs="Calibri"/>
+          <w:lang w:val="ce-Cyrl-RU"/>
+        </w:rPr>
+        <w:t xml:space="preserve"> - </w:t>
+      </w:r>
+      <w:r>
+        <w:rPr>
+          <w:rFonts w:ascii="Calibri" w:hAnsi="Calibri" w:cs="Calibri"/>
+          <w:i/>
+          <w:iCs/>
+          <w:lang w:val="ce-Cyrl-RU"/>
+        </w:rPr>
+        <w:t>кер</w:t>
+      </w:r>
+      <w:r>
+        <w:rPr>
+          <w:rFonts w:ascii="Calibri" w:hAnsi="Calibri" w:cs="Calibri"/>
+          <w:lang w:val="ce-Cyrl-RU"/>
+        </w:rPr>
+        <w:t>;</w:t>
+      </w:r>
+      <w:r>
+        <w:rPr>
+          <w:rFonts w:ascii="Calibri" w:hAnsi="Calibri" w:cs="Calibri"/>
+          <w:lang w:val="ce-Cyrl-RU"/>
+        </w:rPr>
+        <w:t xml:space="preserve"> </w:t>
+      </w:r>
+      <w:r>
+        <w:rPr>
+          <w:rFonts w:ascii="Calibri" w:hAnsi="Calibri" w:cs="Calibri"/>
+          <w:lang w:val="ce-Cyrl-RU"/>
+        </w:rPr>
+        <w:br/>
+        <w:t>- приставка (префикс</w:t>
+      </w:r>
+      <w:r>
+        <w:rPr>
+          <w:rFonts w:ascii="Calibri" w:hAnsi="Calibri" w:cs="Calibri"/>
+          <w:lang w:val="ce-Cyrl-RU"/>
+        </w:rPr>
+        <w:t xml:space="preserve">) и </w:t>
+      </w:r>
+      <w:r>
+        <w:rPr>
+          <w:rFonts w:ascii="Calibri" w:hAnsi="Calibri" w:cs="Calibri"/>
+          <w:lang w:val="ce-Cyrl-RU"/>
+        </w:rPr>
+        <w:t>суффикс – служат для образования новых слов, входят в основу слова</w:t>
+      </w:r>
+      <w:r>
+        <w:rPr>
+          <w:rFonts w:ascii="Calibri" w:hAnsi="Calibri" w:cs="Calibri"/>
+          <w:lang w:val="ce-Cyrl-RU"/>
+        </w:rPr>
+        <w:t xml:space="preserve"> – </w:t>
+      </w:r>
+      <w:r>
+        <w:rPr>
+          <w:rFonts w:ascii="Calibri" w:hAnsi="Calibri" w:cs="Calibri"/>
+          <w:i/>
+          <w:iCs/>
+          <w:lang w:val="ce-Cyrl-RU"/>
+        </w:rPr>
+        <w:t>д1а</w:t>
+      </w:r>
+      <w:r>
+        <w:rPr>
+          <w:rFonts w:ascii="Calibri" w:hAnsi="Calibri" w:cs="Calibri"/>
+          <w:lang w:val="ce-Cyrl-RU"/>
+        </w:rPr>
+        <w:t>я, кераш</w:t>
+      </w:r>
+      <w:r>
+        <w:rPr>
+          <w:rFonts w:ascii="Calibri" w:hAnsi="Calibri" w:cs="Calibri"/>
+          <w:lang w:val="ce-Cyrl-RU"/>
+        </w:rPr>
+        <w:t>.</w:t>
+      </w:r>
+      <w:r>
+        <w:rPr>
+          <w:rFonts w:ascii="Calibri" w:hAnsi="Calibri" w:cs="Calibri"/>
+          <w:lang w:val="ce-Cyrl-RU"/>
+        </w:rPr>
+        <w:br/>
+      </w:r>
+      <w:r>
+        <w:rPr>
+          <w:rFonts w:ascii="Calibri" w:hAnsi="Calibri" w:cs="Calibri"/>
+          <w:lang w:val="ce-Cyrl-RU"/>
+        </w:rPr>
+        <w:t>- окончани</w:t>
+      </w:r>
+      <w:r>
+        <w:rPr>
+          <w:rFonts w:ascii="Calibri" w:hAnsi="Calibri" w:cs="Calibri"/>
+          <w:lang w:val="ce-Cyrl-RU"/>
+        </w:rPr>
+        <w:t>я</w:t>
+      </w:r>
+      <w:r>
+        <w:rPr>
+          <w:rFonts w:ascii="Calibri" w:hAnsi="Calibri" w:cs="Calibri"/>
+          <w:lang w:val="ce-Cyrl-RU"/>
+        </w:rPr>
+        <w:t xml:space="preserve"> (флексия) – </w:t>
+      </w:r>
+      <w:r>
+        <w:rPr>
+          <w:rFonts w:ascii="Calibri" w:hAnsi="Calibri" w:cs="Calibri"/>
+          <w:lang w:val="ce-Cyrl-RU"/>
+        </w:rPr>
+        <w:t>широко используется в ингушском, служат для изменения формы слова по падежам,  временам, по числу, и т.д</w:t>
+      </w:r>
+      <w:r>
+        <w:rPr>
+          <w:rFonts w:ascii="Calibri" w:hAnsi="Calibri" w:cs="Calibri"/>
+          <w:lang w:val="ce-Cyrl-RU"/>
+        </w:rPr>
+        <w:t>.</w:t>
+      </w:r>
+      <w:r>
+        <w:rPr>
+          <w:rFonts w:ascii="Calibri" w:hAnsi="Calibri" w:cs="Calibri"/>
+          <w:lang w:val="ce-Cyrl-RU"/>
+        </w:rPr>
+        <w:t>, - кер</w:t>
+      </w:r>
+      <w:r>
+        <w:rPr>
+          <w:rFonts w:ascii="Calibri" w:hAnsi="Calibri" w:cs="Calibri"/>
+          <w:lang w:val="ce-Cyrl-RU"/>
+        </w:rPr>
+        <w:t>аш</w:t>
+      </w:r>
+      <w:r>
+        <w:rPr>
+          <w:rFonts w:ascii="Calibri" w:hAnsi="Calibri" w:cs="Calibri"/>
+          <w:i/>
+          <w:iCs/>
+          <w:lang w:val="ce-Cyrl-RU"/>
+        </w:rPr>
+        <w:t>ка</w:t>
+      </w:r>
+      <w:r>
+        <w:rPr>
+          <w:rFonts w:ascii="Calibri" w:hAnsi="Calibri" w:cs="Calibri"/>
+          <w:lang w:val="ce-Cyrl-RU"/>
+        </w:rPr>
+        <w:br/>
+      </w:r>
+      <w:r>
+        <w:rPr>
+          <w:rFonts w:ascii="Calibri" w:hAnsi="Calibri" w:cs="Calibri"/>
+          <w:lang w:val="ce-Cyrl-RU"/>
+        </w:rPr>
         <w:t>Мальсагов, стр. 13</w:t>
+      </w:r>
+    </w:p>
+    <w:p>
+      <w:pPr>
+        <w:rPr>
+          <w:rFonts w:ascii="Calibri" w:hAnsi="Calibri" w:cs="Calibri"/>
+          <w:lang w:val="ce-Cyrl-RU"/>
+        </w:rPr>
+      </w:pPr>
+      <w:r>
+        <w:rPr>
+          <w:rFonts w:ascii="Calibri" w:hAnsi="Calibri" w:cs="Calibri"/>
+          <w:lang w:val="ce-Cyrl-RU"/>
+        </w:rPr>
+        <w:t>Особенность ингушского (и чеченского) языка - г</w:t>
+      </w:r>
+      <w:r>
+        <w:rPr>
+          <w:rFonts w:ascii="Calibri" w:hAnsi="Calibri" w:cs="Calibri"/>
+          <w:lang w:val="ce-Cyrl-RU"/>
+        </w:rPr>
+        <w:t>лаголы, состоящие из трех или более слогов, производны или заимствованы.</w:t>
+      </w:r>
+      <w:r>
+        <w:rPr>
+          <w:rFonts w:ascii="Calibri" w:hAnsi="Calibri" w:cs="Calibri"/>
+          <w:lang w:val="ce-Cyrl-RU"/>
+        </w:rPr>
+        <w:br/>
+        <w:t>Долакова, стр. 219</w:t>
       </w:r>
       <w:r>
         <w:rPr>
@@ -25852,7 +26170,21 @@
           <w:rFonts w:ascii="Calibri" w:hAnsi="Calibri" w:cs="Calibri"/>
           <w:lang w:val="ce-Cyrl-RU"/>
         </w:rPr>
-        <w:t>Различий очень много, п</w:t>
+        <w:t xml:space="preserve">Различий </w:t>
+      </w:r>
+      <w:r>
+        <w:rPr>
+          <w:rFonts w:ascii="Calibri" w:hAnsi="Calibri" w:cs="Calibri"/>
+          <w:lang w:val="ce-Cyrl-RU"/>
+        </w:rPr>
+        <w:t xml:space="preserve">в словах </w:t>
+      </w:r>
+      <w:r>
+        <w:rPr>
+          <w:rFonts w:ascii="Calibri" w:hAnsi="Calibri" w:cs="Calibri"/>
+          <w:lang w:val="ce-Cyrl-RU"/>
+        </w:rPr>
+        <w:t>очень много, п</w:t>
       </w:r>
       <w:r>
         <w:rPr>
@@ -25873,7 +26205,14 @@
           <w:rFonts w:ascii="Calibri" w:hAnsi="Calibri" w:cs="Calibri"/>
           <w:lang w:val="ce-Cyrl-RU"/>
         </w:rPr>
-        <w:t>Я здесь привожу слова, наиболее часто встречающиеся в этой книге.</w:t>
+        <w:t>С</w:t>
+      </w:r>
+      <w:r>
+        <w:rPr>
+          <w:rFonts w:ascii="Calibri" w:hAnsi="Calibri" w:cs="Calibri"/>
+          <w:lang w:val="ce-Cyrl-RU"/>
+        </w:rPr>
+        <w:t>лова, наиболее часто встречающиеся в этой книге.</w:t>
       </w:r>
     </w:p>
     <w:p>
@@ -30557,7 +30896,7 @@
       <w:pPr>
         <w:rPr>
           <w:rFonts w:ascii="Calibri" w:hAnsi="Calibri" w:cs="Calibri"/>
-          <w:lang w:val="en-US"/>
+          <w:lang w:val="ru-RU"/>
         </w:rPr>
       </w:pPr>
       <w:r>
@@ -30566,46 +30905,6 @@
           <w:lang w:val="ru-RU"/>
         </w:rPr>
         <w:t>Сона а.</w:t>
-      </w:r>
-    </w:p>
-    <w:p>
-      <w:pPr>
-        <w:rPr>
-          <w:rFonts w:ascii="Calibri" w:hAnsi="Calibri" w:cs="Calibri"/>
-          <w:lang w:val="ce-Cyrl-RU"/>
-        </w:rPr>
-      </w:pPr>
-      <w:proofErr w:type="spellStart"/>
-      <w:proofErr w:type="gramStart"/>
-      <w:r>
-        <w:rPr>
-          <w:rFonts w:ascii="Calibri" w:hAnsi="Calibri" w:cs="Calibri"/>
-          <w:lang w:val="en-US"/>
-        </w:rPr>
-        <w:t>todo</w:t>
-      </w:r>
-      <w:proofErr w:type="spellEnd"/>
-      <w:r>
-        <w:rPr>
-          <w:rFonts w:ascii="Calibri" w:hAnsi="Calibri" w:cs="Calibri"/>
-          <w:lang w:val="ru-RU"/>
-        </w:rPr>
-        <w:t xml:space="preserve"> :</w:t>
-      </w:r>
-      <w:proofErr w:type="gramEnd"/>
-      <w:r>
-        <w:rPr>
-          <w:rFonts w:ascii="Calibri" w:hAnsi="Calibri" w:cs="Calibri"/>
-          <w:lang w:val="ru-RU"/>
-        </w:rPr>
-        <w:t xml:space="preserve"> </w:t>
-      </w:r>
-      <w:r>
-        <w:rPr>
-          <w:rFonts w:ascii="Calibri" w:hAnsi="Calibri" w:cs="Calibri"/>
-          <w:lang w:val="ce-Cyrl-RU"/>
-        </w:rPr>
-        <w:t>перенести перечисление в другое место, поставить здесь порядок слов в предложении</w:t>
       </w:r>
     </w:p>
     <w:p>
@@ -35517,6 +35816,19 @@
           <w:lang w:val="ru-RU"/>
         </w:rPr>
         <w:br/>
+      </w:r>
+      <w:r>
+        <w:rPr>
+          <w:rFonts w:ascii="Calibri" w:hAnsi="Calibri" w:cs="Calibri"/>
+          <w:lang w:val="ru-RU"/>
+        </w:rPr>
+        <w:t xml:space="preserve">Мальсагов, стр. 38 ; </w:t>
+      </w:r>
+      <w:r>
+        <w:rPr>
+          <w:rFonts w:ascii="Calibri" w:hAnsi="Calibri" w:cs="Calibri"/>
+          <w:lang w:val="ru-RU"/>
+        </w:rPr>
         <w:t>Мациев стр. 589</w:t>
       </w:r>
     </w:p>
@@ -35730,7 +36042,6 @@
         </w:rPr>
         <w:br/>
       </w:r>
-      <w:proofErr w:type="gramStart"/>
       <w:r>
         <w:rPr>
           <w:rFonts w:ascii="Calibri" w:hAnsi="Calibri" w:cs="Calibri"/>
@@ -35743,15 +36054,7 @@
           <w:rFonts w:ascii="Calibri" w:hAnsi="Calibri" w:cs="Calibri"/>
           <w:lang w:val="ru-RU"/>
         </w:rPr>
-        <w:t xml:space="preserve"> :</w:t>
-      </w:r>
-      <w:proofErr w:type="gramEnd"/>
-      <w:r>
-        <w:rPr>
-          <w:rFonts w:ascii="Calibri" w:hAnsi="Calibri" w:cs="Calibri"/>
-          <w:lang w:val="ru-RU"/>
-        </w:rPr>
-        <w:t xml:space="preserve"> </w:t>
+        <w:t xml:space="preserve"> : </w:t>
       </w:r>
       <w:r>
         <w:rPr>
@@ -36492,7 +36795,149 @@
           <w:rFonts w:ascii="Calibri" w:hAnsi="Calibri" w:cs="Calibri"/>
           <w:lang w:val="ru-RU"/>
         </w:rPr>
-        <w:t>В русском и других европейских языках сначала называется главный предмет, а его свойства и связи уточняются после.</w:t>
+        <w:t>В русском язык</w:t>
+      </w:r>
+      <w:r>
+        <w:rPr>
+          <w:rFonts w:ascii="Calibri" w:hAnsi="Calibri" w:cs="Calibri"/>
+          <w:lang w:val="ru-RU"/>
+        </w:rPr>
+        <w:t>е</w:t>
+      </w:r>
+      <w:r>
+        <w:rPr>
+          <w:rFonts w:ascii="Calibri" w:hAnsi="Calibri" w:cs="Calibri"/>
+          <w:lang w:val="ru-RU"/>
+        </w:rPr>
+        <w:t xml:space="preserve"> сначала называется главный предмет, а </w:t>
+      </w:r>
+      <w:r>
+        <w:rPr>
+          <w:rFonts w:ascii="Calibri" w:hAnsi="Calibri" w:cs="Calibri"/>
+          <w:lang w:val="ru-RU"/>
+        </w:rPr>
+        <w:t>потом дается его описание</w:t>
+      </w:r>
+      <w:r>
+        <w:rPr>
+          <w:rFonts w:ascii="Calibri" w:hAnsi="Calibri" w:cs="Calibri"/>
+          <w:lang w:val="ru-RU"/>
+        </w:rPr>
+        <w:t>.</w:t>
+      </w:r>
+      <w:r>
+        <w:rPr>
+          <w:rFonts w:ascii="Calibri" w:hAnsi="Calibri" w:cs="Calibri"/>
+          <w:lang w:val="ru-RU"/>
+        </w:rPr>
+        <w:br/>
+      </w:r>
+      <w:r>
+        <w:rPr>
+          <w:rFonts w:ascii="Calibri" w:hAnsi="Calibri" w:cs="Calibri"/>
+          <w:i/>
+          <w:iCs/>
+          <w:lang w:val="ru-RU"/>
+        </w:rPr>
+        <w:t>Дом</w:t>
+      </w:r>
+      <w:r>
+        <w:rPr>
+          <w:rFonts w:ascii="Calibri" w:hAnsi="Calibri" w:cs="Calibri"/>
+          <w:i/>
+          <w:iCs/>
+          <w:lang w:val="ru-RU"/>
+        </w:rPr>
+        <w:t xml:space="preserve"> </w:t>
+      </w:r>
+      <w:r>
+        <w:rPr>
+          <w:rFonts w:ascii="Calibri" w:hAnsi="Calibri" w:cs="Calibri"/>
+          <w:lang w:val="ru-RU"/>
+        </w:rPr>
+        <w:t>(предмет)</w:t>
+      </w:r>
+      <w:r>
+        <w:rPr>
+          <w:rFonts w:ascii="Calibri" w:hAnsi="Calibri" w:cs="Calibri"/>
+          <w:i/>
+          <w:iCs/>
+          <w:lang w:val="ru-RU"/>
+        </w:rPr>
+        <w:t xml:space="preserve"> </w:t>
+      </w:r>
+      <w:r>
+        <w:rPr>
+          <w:rFonts w:ascii="Calibri" w:hAnsi="Calibri" w:cs="Calibri"/>
+          <w:i/>
+          <w:iCs/>
+          <w:lang w:val="ru-RU"/>
+        </w:rPr>
+        <w:t xml:space="preserve">-&gt; </w:t>
+      </w:r>
+      <w:r>
+        <w:rPr>
+          <w:rFonts w:ascii="Calibri" w:hAnsi="Calibri" w:cs="Calibri"/>
+          <w:lang w:val="ru-RU"/>
+        </w:rPr>
+        <w:t xml:space="preserve"> </w:t>
+      </w:r>
+      <w:r>
+        <w:rPr>
+          <w:rFonts w:ascii="Calibri" w:hAnsi="Calibri" w:cs="Calibri"/>
+          <w:i/>
+          <w:iCs/>
+          <w:lang w:val="ru-RU"/>
+        </w:rPr>
+        <w:t xml:space="preserve">который </w:t>
+      </w:r>
+      <w:r>
+        <w:rPr>
+          <w:rFonts w:ascii="Calibri" w:hAnsi="Calibri" w:cs="Calibri"/>
+          <w:i/>
+          <w:iCs/>
+          <w:lang w:val="ru-RU"/>
+        </w:rPr>
+        <w:t>построил</w:t>
+      </w:r>
+      <w:r>
+        <w:rPr>
+          <w:rFonts w:ascii="Calibri" w:hAnsi="Calibri" w:cs="Calibri"/>
+          <w:i/>
+          <w:iCs/>
+          <w:lang w:val="ru-RU"/>
+        </w:rPr>
+        <w:t xml:space="preserve"> Джек</w:t>
+      </w:r>
+      <w:r>
+        <w:rPr>
+          <w:rFonts w:ascii="Calibri" w:hAnsi="Calibri" w:cs="Calibri"/>
+          <w:i/>
+          <w:iCs/>
+          <w:lang w:val="ru-RU"/>
+        </w:rPr>
+        <w:t xml:space="preserve"> </w:t>
+      </w:r>
+      <w:r>
+        <w:rPr>
+          <w:rFonts w:ascii="Calibri" w:hAnsi="Calibri" w:cs="Calibri"/>
+          <w:lang w:val="ce-Cyrl-RU"/>
+        </w:rPr>
+        <w:t>(описание)</w:t>
+      </w:r>
+      <w:r>
+        <w:rPr>
+          <w:rFonts w:ascii="Calibri" w:hAnsi="Calibri" w:cs="Calibri"/>
+          <w:lang w:val="ru-RU"/>
+        </w:rPr>
+        <w:t>.</w:t>
+      </w:r>
+      <w:r>
+        <w:rPr>
+          <w:rFonts w:ascii="Calibri" w:hAnsi="Calibri" w:cs="Calibri"/>
+          <w:lang w:val="ru-RU"/>
+        </w:rPr>
+        <w:t xml:space="preserve"> </w:t>
       </w:r>
     </w:p>
     <w:p>
@@ -36507,7 +36952,213 @@
           <w:rFonts w:ascii="Calibri" w:hAnsi="Calibri" w:cs="Calibri"/>
           <w:lang w:val="ru-RU"/>
         </w:rPr>
-        <w:t>В ингушском языке сначала выстраивается вся цепочка определений и уточнений, и только в самом конце произносится сам предмет, к которому все это относится.</w:t>
+        <w:t xml:space="preserve">В ингушском языке сначала </w:t>
+      </w:r>
+      <w:r>
+        <w:rPr>
+          <w:rFonts w:ascii="Calibri" w:hAnsi="Calibri" w:cs="Calibri"/>
+          <w:lang w:val="ru-RU"/>
+        </w:rPr>
+        <w:t>да</w:t>
+      </w:r>
+      <w:r>
+        <w:rPr>
+          <w:rFonts w:ascii="Calibri" w:hAnsi="Calibri" w:cs="Calibri"/>
+          <w:lang w:val="ru-RU"/>
+        </w:rPr>
+        <w:t>ю</w:t>
+      </w:r>
+      <w:r>
+        <w:rPr>
+          <w:rFonts w:ascii="Calibri" w:hAnsi="Calibri" w:cs="Calibri"/>
+          <w:lang w:val="ru-RU"/>
+        </w:rPr>
+        <w:t xml:space="preserve">тся </w:t>
+      </w:r>
+      <w:r>
+        <w:rPr>
+          <w:rFonts w:ascii="Calibri" w:hAnsi="Calibri" w:cs="Calibri"/>
+          <w:lang w:val="ru-RU"/>
+        </w:rPr>
+        <w:t>все детали предмета</w:t>
+      </w:r>
+      <w:r>
+        <w:rPr>
+          <w:rFonts w:ascii="Calibri" w:hAnsi="Calibri" w:cs="Calibri"/>
+          <w:lang w:val="ru-RU"/>
+        </w:rPr>
+        <w:t>, и только в самом конце произносится сам предмет, к которому все это относится.</w:t>
+      </w:r>
+      <w:r>
+        <w:rPr>
+          <w:rFonts w:ascii="Calibri" w:hAnsi="Calibri" w:cs="Calibri"/>
+          <w:lang w:val="ru-RU"/>
+        </w:rPr>
+        <w:br/>
+      </w:r>
+      <w:r>
+        <w:rPr>
+          <w:rFonts w:ascii="Calibri" w:hAnsi="Calibri" w:cs="Calibri"/>
+          <w:i/>
+          <w:iCs/>
+          <w:lang w:val="ru-RU"/>
+        </w:rPr>
+        <w:t>Дж</w:t>
+      </w:r>
+      <w:r>
+        <w:rPr>
+          <w:rFonts w:ascii="Calibri" w:hAnsi="Calibri" w:cs="Calibri"/>
+          <w:i/>
+          <w:iCs/>
+          <w:lang w:val="ru-RU"/>
+        </w:rPr>
+        <w:t>аь</w:t>
+      </w:r>
+      <w:r>
+        <w:rPr>
+          <w:rFonts w:ascii="Calibri" w:hAnsi="Calibri" w:cs="Calibri"/>
+          <w:i/>
+          <w:iCs/>
+          <w:lang w:val="ru-RU"/>
+        </w:rPr>
+        <w:t>к</w:t>
+      </w:r>
+      <w:r>
+        <w:rPr>
+          <w:rFonts w:ascii="Calibri" w:hAnsi="Calibri" w:cs="Calibri"/>
+          <w:i/>
+          <w:iCs/>
+          <w:lang w:val="ru-RU"/>
+        </w:rPr>
+        <w:t>о</w:t>
+      </w:r>
+      <w:r>
+        <w:rPr>
+          <w:rFonts w:ascii="Calibri" w:hAnsi="Calibri" w:cs="Calibri"/>
+          <w:i/>
+          <w:iCs/>
+          <w:lang w:val="ru-RU"/>
+        </w:rPr>
+        <w:t xml:space="preserve"> даь дола</w:t>
+      </w:r>
+      <w:r>
+        <w:rPr>
+          <w:rFonts w:ascii="Calibri" w:hAnsi="Calibri" w:cs="Calibri"/>
+          <w:i/>
+          <w:iCs/>
+          <w:lang w:val="ru-RU"/>
+        </w:rPr>
+        <w:t xml:space="preserve"> </w:t>
+      </w:r>
+      <w:r>
+        <w:rPr>
+          <w:rFonts w:ascii="Calibri" w:hAnsi="Calibri" w:cs="Calibri"/>
+          <w:i/>
+          <w:iCs/>
+          <w:lang w:val="ru-RU"/>
+        </w:rPr>
+        <w:t>ц1а</w:t>
+      </w:r>
+      <w:r>
+        <w:rPr>
+          <w:rFonts w:ascii="Calibri" w:hAnsi="Calibri" w:cs="Calibri"/>
+          <w:lang w:val="ru-RU"/>
+        </w:rPr>
+        <w:t xml:space="preserve"> </w:t>
+      </w:r>
+      <w:r>
+        <w:rPr>
+          <w:rFonts w:ascii="Calibri" w:hAnsi="Calibri" w:cs="Calibri"/>
+          <w:lang w:val="ru-RU"/>
+        </w:rPr>
+        <w:t>:</w:t>
+      </w:r>
+      <w:r>
+        <w:rPr>
+          <w:rFonts w:ascii="Calibri" w:hAnsi="Calibri" w:cs="Calibri"/>
+          <w:lang w:val="ru-RU"/>
+        </w:rPr>
+        <w:t xml:space="preserve"> </w:t>
+      </w:r>
+      <w:r>
+        <w:rPr>
+          <w:rFonts w:ascii="Calibri" w:hAnsi="Calibri" w:cs="Calibri"/>
+          <w:i/>
+          <w:iCs/>
+          <w:lang w:val="ru-RU"/>
+        </w:rPr>
+        <w:t>Джеком построен</w:t>
+      </w:r>
+      <w:r>
+        <w:rPr>
+          <w:rFonts w:ascii="Calibri" w:hAnsi="Calibri" w:cs="Calibri"/>
+          <w:i/>
+          <w:iCs/>
+          <w:lang w:val="ru-RU"/>
+        </w:rPr>
+        <w:t>ный</w:t>
+      </w:r>
+      <w:r>
+        <w:rPr>
+          <w:rFonts w:ascii="Calibri" w:hAnsi="Calibri" w:cs="Calibri"/>
+          <w:lang w:val="ru-RU"/>
+        </w:rPr>
+        <w:t xml:space="preserve"> </w:t>
+      </w:r>
+      <w:r>
+        <w:rPr>
+          <w:rFonts w:ascii="Calibri" w:hAnsi="Calibri" w:cs="Calibri"/>
+          <w:lang w:val="ru-RU"/>
+        </w:rPr>
+        <w:t>(описание)</w:t>
+      </w:r>
+      <w:r>
+        <w:rPr>
+          <w:rFonts w:ascii="Calibri" w:hAnsi="Calibri" w:cs="Calibri"/>
+          <w:lang w:val="ru-RU"/>
+        </w:rPr>
+        <w:t xml:space="preserve"> </w:t>
+      </w:r>
+      <w:r>
+        <w:rPr>
+          <w:rFonts w:ascii="Calibri" w:hAnsi="Calibri" w:cs="Calibri"/>
+          <w:i/>
+          <w:iCs/>
+          <w:lang w:val="ru-RU"/>
+        </w:rPr>
+        <w:t xml:space="preserve">-&gt; </w:t>
+      </w:r>
+      <w:r>
+        <w:rPr>
+          <w:rFonts w:ascii="Calibri" w:hAnsi="Calibri" w:cs="Calibri"/>
+          <w:i/>
+          <w:iCs/>
+          <w:lang w:val="ru-RU"/>
+        </w:rPr>
+        <w:t>дом</w:t>
+      </w:r>
+      <w:r>
+        <w:rPr>
+          <w:rFonts w:ascii="Calibri" w:hAnsi="Calibri" w:cs="Calibri"/>
+          <w:i/>
+          <w:iCs/>
+          <w:lang w:val="ru-RU"/>
+        </w:rPr>
+        <w:t xml:space="preserve"> </w:t>
+      </w:r>
+      <w:r>
+        <w:rPr>
+          <w:rFonts w:ascii="Calibri" w:hAnsi="Calibri" w:cs="Calibri"/>
+          <w:lang w:val="ce-Cyrl-RU"/>
+        </w:rPr>
+        <w:t>(предмет)</w:t>
+      </w:r>
+      <w:r>
+        <w:rPr>
+          <w:rFonts w:ascii="Calibri" w:hAnsi="Calibri" w:cs="Calibri"/>
+          <w:lang w:val="ru-RU"/>
+        </w:rPr>
+        <w:t>.</w:t>
       </w:r>
     </w:p>
     <w:p>
@@ -36520,90 +37171,9 @@
       <w:r>
         <w:rPr>
           <w:rFonts w:ascii="Calibri" w:hAnsi="Calibri" w:cs="Calibri"/>
-          <w:i/>
-          <w:iCs/>
-          <w:lang w:val="ru-RU"/>
-        </w:rPr>
-        <w:t>Дом</w:t>
-      </w:r>
-      <w:r>
-        <w:rPr>
-          <w:rFonts w:ascii="Calibri" w:hAnsi="Calibri" w:cs="Calibri"/>
-          <w:lang w:val="ru-RU"/>
-        </w:rPr>
-        <w:t xml:space="preserve"> </w:t>
-      </w:r>
-      <w:r>
-        <w:rPr>
-          <w:rFonts w:ascii="Calibri" w:hAnsi="Calibri" w:cs="Calibri"/>
-          <w:lang w:val="ru-RU"/>
-        </w:rPr>
-        <w:t>(</w:t>
-      </w:r>
-      <w:r>
-        <w:rPr>
-          <w:rFonts w:ascii="Calibri" w:hAnsi="Calibri" w:cs="Calibri"/>
-          <w:lang w:val="ru-RU"/>
-        </w:rPr>
-        <w:t>главное</w:t>
-      </w:r>
-      <w:r>
-        <w:rPr>
-          <w:rFonts w:ascii="Calibri" w:hAnsi="Calibri" w:cs="Calibri"/>
-          <w:lang w:val="ru-RU"/>
-        </w:rPr>
-        <w:t>)</w:t>
-      </w:r>
-      <w:r>
-        <w:rPr>
-          <w:rFonts w:ascii="Calibri" w:hAnsi="Calibri" w:cs="Calibri"/>
-          <w:lang w:val="ru-RU"/>
-        </w:rPr>
-        <w:t xml:space="preserve"> </w:t>
-      </w:r>
-      <w:r>
-        <w:rPr>
-          <w:rFonts w:ascii="Calibri" w:hAnsi="Calibri" w:cs="Calibri"/>
-          <w:i/>
-          <w:iCs/>
-          <w:lang w:val="ru-RU"/>
-        </w:rPr>
-        <w:t>который построен Джеком</w:t>
-      </w:r>
-      <w:r>
-        <w:rPr>
-          <w:rFonts w:ascii="Calibri" w:hAnsi="Calibri" w:cs="Calibri"/>
-          <w:lang w:val="ru-RU"/>
-        </w:rPr>
-        <w:t xml:space="preserve"> </w:t>
-      </w:r>
-      <w:r>
-        <w:rPr>
-          <w:rFonts w:ascii="Calibri" w:hAnsi="Calibri" w:cs="Calibri"/>
-          <w:lang w:val="ru-RU"/>
-        </w:rPr>
-        <w:t>(</w:t>
-      </w:r>
-      <w:r>
-        <w:rPr>
-          <w:rFonts w:ascii="Calibri" w:hAnsi="Calibri" w:cs="Calibri"/>
-          <w:lang w:val="ru-RU"/>
-        </w:rPr>
-        <w:t>описание</w:t>
-      </w:r>
-      <w:r>
-        <w:rPr>
-          <w:rFonts w:ascii="Calibri" w:hAnsi="Calibri" w:cs="Calibri"/>
-          <w:lang w:val="ru-RU"/>
-        </w:rPr>
-        <w:t>)</w:t>
-      </w:r>
-      <w:r>
-        <w:rPr>
-          <w:rFonts w:ascii="Calibri" w:hAnsi="Calibri" w:cs="Calibri"/>
-          <w:lang w:val="ru-RU"/>
-        </w:rPr>
-        <w:t>.</w:t>
+          <w:lang w:val="ru-RU"/>
+        </w:rPr>
+        <w:t xml:space="preserve">Примеры из данной притчи: </w:t>
       </w:r>
     </w:p>
     <w:p>
@@ -36616,104 +37186,37 @@
       <w:r>
         <w:rPr>
           <w:rFonts w:ascii="Calibri" w:hAnsi="Calibri" w:cs="Calibri"/>
-          <w:i/>
-          <w:iCs/>
-          <w:lang w:val="ru-RU"/>
-        </w:rPr>
-        <w:t>Джекас даь дола</w:t>
-      </w:r>
-      <w:r>
-        <w:rPr>
-          <w:rFonts w:ascii="Calibri" w:hAnsi="Calibri" w:cs="Calibri"/>
-          <w:lang w:val="ru-RU"/>
-        </w:rPr>
-        <w:t xml:space="preserve"> </w:t>
-      </w:r>
-      <w:r>
-        <w:rPr>
-          <w:rFonts w:ascii="Calibri" w:hAnsi="Calibri" w:cs="Calibri"/>
-          <w:lang w:val="ru-RU"/>
-        </w:rPr>
-        <w:t>(</w:t>
-      </w:r>
-      <w:r>
-        <w:rPr>
-          <w:rFonts w:ascii="Calibri" w:hAnsi="Calibri" w:cs="Calibri"/>
-          <w:lang w:val="ru-RU"/>
-        </w:rPr>
-        <w:t>описание</w:t>
-      </w:r>
-      <w:r>
-        <w:rPr>
-          <w:rFonts w:ascii="Calibri" w:hAnsi="Calibri" w:cs="Calibri"/>
-          <w:lang w:val="ru-RU"/>
-        </w:rPr>
-        <w:t>)</w:t>
-      </w:r>
-      <w:r>
-        <w:rPr>
-          <w:rFonts w:ascii="Calibri" w:hAnsi="Calibri" w:cs="Calibri"/>
-          <w:lang w:val="ru-RU"/>
-        </w:rPr>
-        <w:t xml:space="preserve"> </w:t>
-      </w:r>
-      <w:r>
-        <w:rPr>
-          <w:rFonts w:ascii="Calibri" w:hAnsi="Calibri" w:cs="Calibri"/>
-          <w:i/>
-          <w:iCs/>
-          <w:lang w:val="ru-RU"/>
-        </w:rPr>
-        <w:t>ц1а</w:t>
-      </w:r>
-      <w:r>
-        <w:rPr>
-          <w:rFonts w:ascii="Calibri" w:hAnsi="Calibri" w:cs="Calibri"/>
-          <w:lang w:val="ru-RU"/>
-        </w:rPr>
-        <w:t xml:space="preserve"> </w:t>
-      </w:r>
-      <w:r>
-        <w:rPr>
-          <w:rFonts w:ascii="Calibri" w:hAnsi="Calibri" w:cs="Calibri"/>
-          <w:lang w:val="ru-RU"/>
-        </w:rPr>
-        <w:t>(</w:t>
-      </w:r>
-      <w:r>
-        <w:rPr>
-          <w:rFonts w:ascii="Calibri" w:hAnsi="Calibri" w:cs="Calibri"/>
-          <w:lang w:val="ru-RU"/>
-        </w:rPr>
-        <w:t>главное</w:t>
-      </w:r>
-      <w:r>
-        <w:rPr>
-          <w:rFonts w:ascii="Calibri" w:hAnsi="Calibri" w:cs="Calibri"/>
-          <w:lang w:val="ru-RU"/>
-        </w:rPr>
-        <w:t>)</w:t>
-      </w:r>
-      <w:r>
-        <w:rPr>
-          <w:rFonts w:ascii="Calibri" w:hAnsi="Calibri" w:cs="Calibri"/>
-          <w:lang w:val="ru-RU"/>
-        </w:rPr>
-        <w:t xml:space="preserve"> </w:t>
-      </w:r>
-      <w:r>
-        <w:rPr>
-          <w:rFonts w:ascii="Calibri" w:hAnsi="Calibri" w:cs="Calibri"/>
-          <w:lang w:val="ru-RU"/>
-        </w:rPr>
-        <w:t xml:space="preserve">- </w:t>
-      </w:r>
-      <w:r>
-        <w:rPr>
-          <w:rFonts w:ascii="Calibri" w:hAnsi="Calibri" w:cs="Calibri"/>
-          <w:lang w:val="ru-RU"/>
-        </w:rPr>
-        <w:t>Джеком построен который дом.</w:t>
+          <w:lang w:val="ru-RU"/>
+        </w:rPr>
+        <w:t xml:space="preserve">«Хьаг1ара чу ж1али кхабар» - </w:t>
+      </w:r>
+      <w:r>
+        <w:rPr>
+          <w:rFonts w:ascii="Calibri" w:hAnsi="Calibri" w:cs="Calibri"/>
+          <w:lang w:val="ru-RU"/>
+        </w:rPr>
+        <w:t>буквально</w:t>
+      </w:r>
+      <w:r>
+        <w:rPr>
+          <w:rFonts w:ascii="Calibri" w:hAnsi="Calibri" w:cs="Calibri"/>
+          <w:lang w:val="ru-RU"/>
+        </w:rPr>
+        <w:t xml:space="preserve"> «пещер</w:t>
+      </w:r>
+      <w:r>
+        <w:rPr>
+          <w:rFonts w:ascii="Calibri" w:hAnsi="Calibri" w:cs="Calibri"/>
+          <w:lang w:val="ru-RU"/>
+        </w:rPr>
+        <w:t>е</w:t>
+      </w:r>
+      <w:r>
+        <w:rPr>
+          <w:rFonts w:ascii="Calibri" w:hAnsi="Calibri" w:cs="Calibri"/>
+          <w:lang w:val="ru-RU"/>
+        </w:rPr>
+        <w:t xml:space="preserve"> в собаки содержание» - «содержание собаки в пещере»;</w:t>
       </w:r>
     </w:p>
     <w:p>
@@ -36728,7 +37231,49 @@
           <w:rFonts w:ascii="Calibri" w:hAnsi="Calibri" w:cs="Calibri"/>
           <w:lang w:val="ru-RU"/>
         </w:rPr>
-        <w:t xml:space="preserve">Примеры из данной притчи: </w:t>
+        <w:t>«юртаца тайнавац цхьа къонах” – “село</w:t>
+      </w:r>
+      <w:r>
+        <w:rPr>
+          <w:rFonts w:ascii="Calibri" w:hAnsi="Calibri" w:cs="Calibri"/>
+          <w:lang w:val="ru-RU"/>
+        </w:rPr>
+        <w:t>м</w:t>
+      </w:r>
+      <w:r>
+        <w:rPr>
+          <w:rFonts w:ascii="Calibri" w:hAnsi="Calibri" w:cs="Calibri"/>
+          <w:lang w:val="ru-RU"/>
+        </w:rPr>
+        <w:t xml:space="preserve"> вместе </w:t>
+      </w:r>
+      <w:r>
+        <w:rPr>
+          <w:rFonts w:ascii="Calibri" w:hAnsi="Calibri" w:cs="Calibri"/>
+          <w:lang w:val="ru-RU"/>
+        </w:rPr>
+        <w:t xml:space="preserve">не </w:t>
+      </w:r>
+      <w:r>
+        <w:rPr>
+          <w:rFonts w:ascii="Calibri" w:hAnsi="Calibri" w:cs="Calibri"/>
+          <w:lang w:val="ru-RU"/>
+        </w:rPr>
+        <w:t>ужился</w:t>
+      </w:r>
+      <w:r>
+        <w:rPr>
+          <w:rFonts w:ascii="Calibri" w:hAnsi="Calibri" w:cs="Calibri"/>
+          <w:lang w:val="ru-RU"/>
+        </w:rPr>
+        <w:t xml:space="preserve"> один </w:t>
+      </w:r>
+      <w:r>
+        <w:rPr>
+          <w:rFonts w:ascii="Calibri" w:hAnsi="Calibri" w:cs="Calibri"/>
+          <w:lang w:val="ru-RU"/>
+        </w:rPr>
+        <w:t>мужчина» - «некий мужчина не ужился с селом»;</w:t>
       </w:r>
     </w:p>
     <w:p>
@@ -36743,7 +37288,105 @@
           <w:rFonts w:ascii="Calibri" w:hAnsi="Calibri" w:cs="Calibri"/>
           <w:lang w:val="ru-RU"/>
         </w:rPr>
-        <w:t>«Хьаг1ара чу ж1али кхабар» - дословно «пещере в собаки содержание» - «содержание собаки в пещере»;</w:t>
+        <w:t>“юртара дIаваха дийзад цун” – “</w:t>
+      </w:r>
+      <w:r>
+        <w:rPr>
+          <w:rFonts w:ascii="Calibri" w:hAnsi="Calibri" w:cs="Calibri"/>
+          <w:lang w:val="ru-RU"/>
+        </w:rPr>
+        <w:t>сел</w:t>
+      </w:r>
+      <w:r>
+        <w:rPr>
+          <w:rFonts w:ascii="Calibri" w:hAnsi="Calibri" w:cs="Calibri"/>
+          <w:lang w:val="ru-RU"/>
+        </w:rPr>
+        <w:t>а</w:t>
+      </w:r>
+      <w:r>
+        <w:rPr>
+          <w:rFonts w:ascii="Calibri" w:hAnsi="Calibri" w:cs="Calibri"/>
+          <w:lang w:val="ru-RU"/>
+        </w:rPr>
+        <w:t xml:space="preserve"> из</w:t>
+      </w:r>
+      <w:r>
+        <w:rPr>
+          <w:rFonts w:ascii="Calibri" w:hAnsi="Calibri" w:cs="Calibri"/>
+          <w:lang w:val="ru-RU"/>
+        </w:rPr>
+        <w:t xml:space="preserve"> </w:t>
+      </w:r>
+      <w:r>
+        <w:rPr>
+          <w:rFonts w:ascii="Calibri" w:hAnsi="Calibri" w:cs="Calibri"/>
+          <w:lang w:val="ru-RU"/>
+        </w:rPr>
+        <w:t>уйти</w:t>
+      </w:r>
+      <w:r>
+        <w:rPr>
+          <w:rFonts w:ascii="Calibri" w:hAnsi="Calibri" w:cs="Calibri"/>
+          <w:lang w:val="ru-RU"/>
+        </w:rPr>
+        <w:t xml:space="preserve"> </w:t>
+      </w:r>
+      <w:r>
+        <w:rPr>
+          <w:rFonts w:ascii="Calibri" w:hAnsi="Calibri" w:cs="Calibri"/>
+          <w:lang w:val="ru-RU"/>
+        </w:rPr>
+        <w:t>надо было</w:t>
+      </w:r>
+      <w:r>
+        <w:rPr>
+          <w:rFonts w:ascii="Calibri" w:hAnsi="Calibri" w:cs="Calibri"/>
+          <w:lang w:val="ru-RU"/>
+        </w:rPr>
+        <w:t xml:space="preserve"> </w:t>
+      </w:r>
+      <w:r>
+        <w:rPr>
+          <w:rFonts w:ascii="Calibri" w:hAnsi="Calibri" w:cs="Calibri"/>
+          <w:lang w:val="ru-RU"/>
+        </w:rPr>
+        <w:t>ему</w:t>
+      </w:r>
+      <w:r>
+        <w:rPr>
+          <w:rFonts w:ascii="Calibri" w:hAnsi="Calibri" w:cs="Calibri"/>
+          <w:lang w:val="ru-RU"/>
+        </w:rPr>
+        <w:t xml:space="preserve">» - «он был вынужден </w:t>
+      </w:r>
+      <w:r>
+        <w:rPr>
+          <w:rFonts w:ascii="Calibri" w:hAnsi="Calibri" w:cs="Calibri"/>
+          <w:lang w:val="ru-RU"/>
+        </w:rPr>
+        <w:t>покинуть</w:t>
+      </w:r>
+      <w:r>
+        <w:rPr>
+          <w:rFonts w:ascii="Calibri" w:hAnsi="Calibri" w:cs="Calibri"/>
+          <w:lang w:val="ru-RU"/>
+        </w:rPr>
+        <w:t xml:space="preserve"> сел</w:t>
+      </w:r>
+      <w:r>
+        <w:rPr>
+          <w:rFonts w:ascii="Calibri" w:hAnsi="Calibri" w:cs="Calibri"/>
+          <w:lang w:val="ru-RU"/>
+        </w:rPr>
+        <w:t>о</w:t>
+      </w:r>
+      <w:r>
+        <w:rPr>
+          <w:rFonts w:ascii="Calibri" w:hAnsi="Calibri" w:cs="Calibri"/>
+          <w:lang w:val="ru-RU"/>
+        </w:rPr>
+        <w:t>».</w:t>
       </w:r>
     </w:p>
     <w:p>
@@ -36758,7 +37401,91 @@
           <w:rFonts w:ascii="Calibri" w:hAnsi="Calibri" w:cs="Calibri"/>
           <w:lang w:val="ru-RU"/>
         </w:rPr>
-        <w:t>«юртаца тайнавац цхьа къонах” – “с селом не ужился некий мужчина» - «некий мужчина не ужился с селом»;</w:t>
+        <w:t>«хьагIара чу вагIаш къонах бIаргавейнав царна” – “пещер</w:t>
+      </w:r>
+      <w:r>
+        <w:rPr>
+          <w:rFonts w:ascii="Calibri" w:hAnsi="Calibri" w:cs="Calibri"/>
+          <w:lang w:val="ru-RU"/>
+        </w:rPr>
+        <w:t>е</w:t>
+      </w:r>
+      <w:r>
+        <w:rPr>
+          <w:rFonts w:ascii="Calibri" w:hAnsi="Calibri" w:cs="Calibri"/>
+          <w:lang w:val="ru-RU"/>
+        </w:rPr>
+        <w:t xml:space="preserve"> в</w:t>
+      </w:r>
+      <w:r>
+        <w:rPr>
+          <w:rFonts w:ascii="Calibri" w:hAnsi="Calibri" w:cs="Calibri"/>
+          <w:lang w:val="ru-RU"/>
+        </w:rPr>
+        <w:t xml:space="preserve"> находящ</w:t>
+      </w:r>
+      <w:r>
+        <w:rPr>
+          <w:rFonts w:ascii="Calibri" w:hAnsi="Calibri" w:cs="Calibri"/>
+          <w:lang w:val="ru-RU"/>
+        </w:rPr>
+        <w:t>ийся</w:t>
+      </w:r>
+      <w:r>
+        <w:rPr>
+          <w:rFonts w:ascii="Calibri" w:hAnsi="Calibri" w:cs="Calibri"/>
+          <w:lang w:val="ru-RU"/>
+        </w:rPr>
+        <w:t xml:space="preserve"> мужчин</w:t>
+      </w:r>
+      <w:r>
+        <w:rPr>
+          <w:rFonts w:ascii="Calibri" w:hAnsi="Calibri" w:cs="Calibri"/>
+          <w:lang w:val="ru-RU"/>
+        </w:rPr>
+        <w:t>а</w:t>
+      </w:r>
+      <w:r>
+        <w:rPr>
+          <w:rFonts w:ascii="Calibri" w:hAnsi="Calibri" w:cs="Calibri"/>
+          <w:lang w:val="ru-RU"/>
+        </w:rPr>
+        <w:t xml:space="preserve"> увиде</w:t>
+      </w:r>
+      <w:r>
+        <w:rPr>
+          <w:rFonts w:ascii="Calibri" w:hAnsi="Calibri" w:cs="Calibri"/>
+          <w:lang w:val="ru-RU"/>
+        </w:rPr>
+        <w:t>лся</w:t>
+      </w:r>
+      <w:r>
+        <w:rPr>
+          <w:rFonts w:ascii="Calibri" w:hAnsi="Calibri" w:cs="Calibri"/>
+          <w:lang w:val="ru-RU"/>
+        </w:rPr>
+        <w:t xml:space="preserve"> </w:t>
+      </w:r>
+      <w:r>
+        <w:rPr>
+          <w:rFonts w:ascii="Calibri" w:hAnsi="Calibri" w:cs="Calibri"/>
+          <w:lang w:val="ru-RU"/>
+        </w:rPr>
+        <w:t>и</w:t>
+      </w:r>
+      <w:r>
+        <w:rPr>
+          <w:rFonts w:ascii="Calibri" w:hAnsi="Calibri" w:cs="Calibri"/>
+          <w:lang w:val="ru-RU"/>
+        </w:rPr>
+        <w:t>м</w:t>
+      </w:r>
+      <w:r>
+        <w:rPr>
+          <w:rFonts w:ascii="Calibri" w:hAnsi="Calibri" w:cs="Calibri"/>
+          <w:lang w:val="ru-RU"/>
+        </w:rPr>
+        <w:t>» - «они увидели мужчину, находящегося в пещере».</w:t>
       </w:r>
     </w:p>
     <w:p>
@@ -36773,7 +37500,84 @@
           <w:rFonts w:ascii="Calibri" w:hAnsi="Calibri" w:cs="Calibri"/>
           <w:lang w:val="ru-RU"/>
         </w:rPr>
-        <w:t>“юртара дIаваха дийзад цун” – “из села уйти вынужден был он» - «он был вынужден уйти из села».</w:t>
+        <w:t>«юртара багенна аьрдагIа хинна саг вийзав царна» - «</w:t>
+      </w:r>
+      <w:r>
+        <w:rPr>
+          <w:rFonts w:ascii="Calibri" w:hAnsi="Calibri" w:cs="Calibri"/>
+          <w:lang w:val="ru-RU"/>
+        </w:rPr>
+        <w:t>села из рт</w:t>
+      </w:r>
+      <w:r>
+        <w:rPr>
+          <w:rFonts w:ascii="Calibri" w:hAnsi="Calibri" w:cs="Calibri"/>
+          <w:lang w:val="ru-RU"/>
+        </w:rPr>
+        <w:t>у</w:t>
+      </w:r>
+      <w:r>
+        <w:rPr>
+          <w:rFonts w:ascii="Calibri" w:hAnsi="Calibri" w:cs="Calibri"/>
+          <w:lang w:val="ru-RU"/>
+        </w:rPr>
+        <w:t xml:space="preserve"> </w:t>
+      </w:r>
+      <w:r>
+        <w:rPr>
+          <w:rFonts w:ascii="Calibri" w:hAnsi="Calibri" w:cs="Calibri"/>
+          <w:lang w:val="ru-RU"/>
+        </w:rPr>
+        <w:t>злой быв</w:t>
+      </w:r>
+      <w:r>
+        <w:rPr>
+          <w:rFonts w:ascii="Calibri" w:hAnsi="Calibri" w:cs="Calibri"/>
+          <w:lang w:val="ru-RU"/>
+        </w:rPr>
+        <w:t>ал</w:t>
+      </w:r>
+      <w:r>
+        <w:rPr>
+          <w:rFonts w:ascii="Calibri" w:hAnsi="Calibri" w:cs="Calibri"/>
+          <w:lang w:val="ru-RU"/>
+        </w:rPr>
+        <w:t xml:space="preserve"> человек</w:t>
+      </w:r>
+      <w:r>
+        <w:rPr>
+          <w:rFonts w:ascii="Calibri" w:hAnsi="Calibri" w:cs="Calibri"/>
+          <w:lang w:val="ru-RU"/>
+        </w:rPr>
+        <w:t xml:space="preserve"> </w:t>
+      </w:r>
+      <w:r>
+        <w:rPr>
+          <w:rFonts w:ascii="Calibri" w:hAnsi="Calibri" w:cs="Calibri"/>
+          <w:lang w:val="ru-RU"/>
+        </w:rPr>
+        <w:t>узнался</w:t>
+      </w:r>
+      <w:r>
+        <w:rPr>
+          <w:rFonts w:ascii="Calibri" w:hAnsi="Calibri" w:cs="Calibri"/>
+          <w:lang w:val="ru-RU"/>
+        </w:rPr>
+        <w:t xml:space="preserve"> </w:t>
+      </w:r>
+      <w:r>
+        <w:rPr>
+          <w:rFonts w:ascii="Calibri" w:hAnsi="Calibri" w:cs="Calibri"/>
+          <w:lang w:val="ru-RU"/>
+        </w:rPr>
+        <w:t>им</w:t>
+      </w:r>
+      <w:r>
+        <w:rPr>
+          <w:rFonts w:ascii="Calibri" w:hAnsi="Calibri" w:cs="Calibri"/>
+          <w:lang w:val="ru-RU"/>
+        </w:rPr>
+        <w:t>» - «они узнали злоязычного односельчанина»</w:t>
       </w:r>
     </w:p>
     <w:p>
@@ -36788,7 +37592,64 @@
           <w:rFonts w:ascii="Calibri" w:hAnsi="Calibri" w:cs="Calibri"/>
           <w:lang w:val="ru-RU"/>
         </w:rPr>
-        <w:t>«хьагIара чу вагIаш къонах бIаргавейнав царна” – “в пещере находящегося мужчину увидели они» - «они увидели мужчину, находящегося в пещере».</w:t>
+        <w:t>С левосторонним ветвлением связана другая особенность ингушского языка – использование послелогов вместо предлогов.</w:t>
+      </w:r>
+      <w:r>
+        <w:rPr>
+          <w:rFonts w:ascii="Calibri" w:hAnsi="Calibri" w:cs="Calibri"/>
+          <w:lang w:val="ru-RU"/>
+        </w:rPr>
+        <w:t xml:space="preserve"> </w:t>
+      </w:r>
+      <w:r>
+        <w:rPr>
+          <w:rFonts w:ascii="Calibri" w:hAnsi="Calibri" w:cs="Calibri"/>
+          <w:lang w:val="ru-RU"/>
+        </w:rPr>
+        <w:br/>
+        <w:t xml:space="preserve">То есть, </w:t>
+      </w:r>
+      <w:r>
+        <w:rPr>
+          <w:rFonts w:ascii="Calibri" w:hAnsi="Calibri" w:cs="Calibri"/>
+          <w:lang w:val="ru-RU"/>
+        </w:rPr>
+        <w:t>говорят «хьаг1ара чу» («пещере в»)</w:t>
+      </w:r>
+      <w:r>
+        <w:rPr>
+          <w:rFonts w:ascii="Calibri" w:hAnsi="Calibri" w:cs="Calibri"/>
+          <w:lang w:val="ru-RU"/>
+        </w:rPr>
+        <w:t xml:space="preserve"> </w:t>
+      </w:r>
+      <w:r>
+        <w:rPr>
+          <w:rFonts w:ascii="Calibri" w:hAnsi="Calibri" w:cs="Calibri"/>
+          <w:lang w:val="ru-RU"/>
+        </w:rPr>
+        <w:t xml:space="preserve">вместо </w:t>
+      </w:r>
+      <w:r>
+        <w:rPr>
+          <w:rFonts w:ascii="Calibri" w:hAnsi="Calibri" w:cs="Calibri"/>
+          <w:lang w:val="ru-RU"/>
+        </w:rPr>
+        <w:t>«чу хьаг1ара»</w:t>
+      </w:r>
+      <w:r>
+        <w:rPr>
+          <w:rFonts w:ascii="Calibri" w:hAnsi="Calibri" w:cs="Calibri"/>
+          <w:lang w:val="ru-RU"/>
+        </w:rPr>
+        <w:t xml:space="preserve"> («в пещере»)</w:t>
+      </w:r>
+      <w:r>
+        <w:rPr>
+          <w:rFonts w:ascii="Calibri" w:hAnsi="Calibri" w:cs="Calibri"/>
+          <w:lang w:val="ru-RU"/>
+        </w:rPr>
+        <w:t>.</w:t>
       </w:r>
     </w:p>
     <w:p>
@@ -36803,7 +37664,21 @@
           <w:rFonts w:ascii="Calibri" w:hAnsi="Calibri" w:cs="Calibri"/>
           <w:lang w:val="ru-RU"/>
         </w:rPr>
-        <w:t>«юртара багенна аьрдагIа хинна саг вийзав царна» - «односельчанина злоязычного узнали они» - «они узнали злоязычного односельчанина»</w:t>
+        <w:t xml:space="preserve">Примеры других языков с левосторонним ветвлением – </w:t>
+      </w:r>
+      <w:r>
+        <w:rPr>
+          <w:rFonts w:ascii="Calibri" w:hAnsi="Calibri" w:cs="Calibri"/>
+          <w:lang w:val="ru-RU"/>
+        </w:rPr>
+        <w:t xml:space="preserve">все северокавказские, все тюркские, </w:t>
+      </w:r>
+      <w:r>
+        <w:rPr>
+          <w:rFonts w:ascii="Calibri" w:hAnsi="Calibri" w:cs="Calibri"/>
+          <w:lang w:val="ru-RU"/>
+        </w:rPr>
+        <w:t>японский, тамильский, хеттский (мертвый язык).</w:t>
       </w:r>
     </w:p>
     <w:p>
@@ -36825,19 +37700,7 @@
         <w:rPr>
           <w:lang w:val="ru-RU"/>
         </w:rPr>
-        <w:t xml:space="preserve"> </w:t>
-      </w:r>
-      <w:r>
-        <w:rPr>
-          <w:lang w:val="ru-RU"/>
-        </w:rPr>
-        <w:t>44</w:t>
-      </w:r>
-      <w:r>
-        <w:rPr>
-          <w:lang w:val="ru-RU"/>
-        </w:rPr>
-        <w:t xml:space="preserve"> : </w:t>
+        <w:t xml:space="preserve"> 44 : </w:t>
       </w:r>
       <w:r>
         <w:rPr>
@@ -36904,28 +37767,7 @@
           <w:rFonts w:ascii="Calibri" w:hAnsi="Calibri" w:cs="Calibri"/>
           <w:lang w:val="ru-RU"/>
         </w:rPr>
-        <w:t>Мальсагов</w:t>
-      </w:r>
-      <w:r>
-        <w:rPr>
-          <w:rFonts w:ascii="Calibri" w:hAnsi="Calibri" w:cs="Calibri"/>
-          <w:lang w:val="ru-RU"/>
-        </w:rPr>
-        <w:t xml:space="preserve"> стр. </w:t>
-      </w:r>
-      <w:r>
-        <w:rPr>
-          <w:rFonts w:ascii="Calibri" w:hAnsi="Calibri" w:cs="Calibri"/>
-          <w:lang w:val="ru-RU"/>
-        </w:rPr>
-        <w:t>3</w:t>
-      </w:r>
-      <w:r>
-        <w:rPr>
-          <w:rFonts w:ascii="Calibri" w:hAnsi="Calibri" w:cs="Calibri"/>
-          <w:lang w:val="ru-RU"/>
-        </w:rPr>
-        <w:t>9</w:t>
+        <w:t>Мальсагов стр. 39</w:t>
       </w:r>
     </w:p>
     <w:p>
@@ -37127,6 +37969,13 @@
           <w:rFonts w:ascii="Calibri" w:hAnsi="Calibri" w:cs="Calibri"/>
           <w:lang w:val="ru-RU"/>
         </w:rPr>
+        <w:t xml:space="preserve">Мальсагов, стр. 34 ; </w:t>
+      </w:r>
+      <w:r>
+        <w:rPr>
+          <w:rFonts w:ascii="Calibri" w:hAnsi="Calibri" w:cs="Calibri"/>
+          <w:lang w:val="ru-RU"/>
+        </w:rPr>
         <w:t>Мациев стр. 583</w:t>
       </w:r>
       <w:r>
@@ -37253,34 +38102,7 @@
           <w:iCs/>
           <w:lang w:val="ru-RU"/>
         </w:rPr>
-        <w:t>ц</w:t>
-      </w:r>
-      <w:r>
-        <w:rPr>
-          <w:rFonts w:ascii="Calibri" w:hAnsi="Calibri" w:cs="Calibri"/>
-          <w:i/>
-          <w:iCs/>
-          <w:lang w:val="ru-RU"/>
-        </w:rPr>
-        <w:t>иггач</w:t>
-      </w:r>
-      <w:r>
-        <w:rPr>
-          <w:rFonts w:ascii="Calibri" w:hAnsi="Calibri" w:cs="Calibri"/>
-          <w:i/>
-          <w:iCs/>
-          <w:lang w:val="ru-RU"/>
-        </w:rPr>
-        <w:t>, х</w:t>
-      </w:r>
-      <w:r>
-        <w:rPr>
-          <w:rFonts w:ascii="Calibri" w:hAnsi="Calibri" w:cs="Calibri"/>
-          <w:i/>
-          <w:iCs/>
-          <w:lang w:val="ru-RU"/>
-        </w:rPr>
-        <w:t>ьаккхашта</w:t>
+        <w:t>циггач, хьаккхашта</w:t>
       </w:r>
       <w:r>
         <w:rPr>
@@ -38127,6 +38949,141 @@
     </w:p>
     <w:p>
       <w:pPr>
+        <w:pStyle w:val="Heading3"/>
+        <w:rPr>
+          <w:b/>
+          <w:bCs/>
+          <w:lang w:val="ru-RU"/>
+        </w:rPr>
+      </w:pPr>
+      <w:r>
+        <w:rPr>
+          <w:rFonts w:ascii="Calibri" w:hAnsi="Calibri" w:cs="Calibri"/>
+          <w:lang w:val="ru-RU"/>
+        </w:rPr>
+        <w:t>Притча</w:t>
+      </w:r>
+      <w:r>
+        <w:rPr>
+          <w:lang w:val="ru-RU"/>
+        </w:rPr>
+        <w:t xml:space="preserve"> </w:t>
+      </w:r>
+      <w:r>
+        <w:rPr>
+          <w:lang w:val="ru-RU"/>
+        </w:rPr>
+        <w:t>78</w:t>
+      </w:r>
+      <w:r>
+        <w:rPr>
+          <w:lang w:val="ru-RU"/>
+        </w:rPr>
+        <w:t xml:space="preserve"> :</w:t>
+      </w:r>
+      <w:r>
+        <w:rPr>
+          <w:lang w:val="ru-RU"/>
+        </w:rPr>
+        <w:t xml:space="preserve"> </w:t>
+      </w:r>
+      <w:r>
+        <w:rPr>
+          <w:rFonts w:ascii="Calibri" w:hAnsi="Calibri" w:cs="Calibri"/>
+          <w:lang w:val="ru-RU"/>
+        </w:rPr>
+        <w:t>Мел лоаца да вахар</w:t>
+      </w:r>
+    </w:p>
+    <w:p>
+      <w:pPr>
+        <w:pStyle w:val="Heading4"/>
+        <w:rPr>
+          <w:lang w:val="ru-RU"/>
+        </w:rPr>
+      </w:pPr>
+      <w:r>
+        <w:rPr>
+          <w:rFonts w:ascii="Calibri" w:hAnsi="Calibri" w:cs="Calibri"/>
+          <w:lang w:val="ru-RU"/>
+        </w:rPr>
+        <w:t>Гр</w:t>
+      </w:r>
+      <w:r>
+        <w:rPr>
+          <w:rFonts w:ascii="Calibri" w:hAnsi="Calibri" w:cs="Calibri"/>
+          <w:lang w:val="ru-RU"/>
+        </w:rPr>
+        <w:t>амматика</w:t>
+      </w:r>
+      <w:r>
+        <w:rPr>
+          <w:lang w:val="ru-RU"/>
+        </w:rPr>
+        <w:t xml:space="preserve">: </w:t>
+      </w:r>
+      <w:r>
+        <w:rPr>
+          <w:rFonts w:ascii="Calibri" w:hAnsi="Calibri" w:cs="Calibri"/>
+          <w:lang w:val="ce-Cyrl-RU"/>
+        </w:rPr>
+        <w:t>Вопросительные местоимения</w:t>
+      </w:r>
+    </w:p>
+    <w:p>
+      <w:pPr>
+        <w:rPr>
+          <w:rFonts w:ascii="Calibri" w:hAnsi="Calibri" w:cs="Calibri"/>
+          <w:lang w:val="ru-RU"/>
+        </w:rPr>
+      </w:pPr>
+      <w:r>
+        <w:rPr>
+          <w:rFonts w:ascii="Calibri" w:hAnsi="Calibri" w:cs="Calibri"/>
+          <w:lang w:val="ru-RU"/>
+        </w:rPr>
+        <w:t>Мала, фу, малаг1</w:t>
+      </w:r>
+      <w:r>
+        <w:rPr>
+          <w:rFonts w:ascii="Calibri" w:hAnsi="Calibri" w:cs="Calibri"/>
+          <w:lang w:val="ru-RU"/>
+        </w:rPr>
+        <w:br/>
+      </w:r>
+      <w:r>
+        <w:rPr>
+          <w:rFonts w:ascii="Calibri" w:hAnsi="Calibri" w:cs="Calibri"/>
+          <w:i/>
+          <w:iCs/>
+          <w:lang w:val="ru-RU"/>
+        </w:rPr>
+        <w:t>Моллаг1ча цхьан ц1ага1ар</w:t>
+      </w:r>
+      <w:r>
+        <w:rPr>
+          <w:rFonts w:ascii="Calibri" w:hAnsi="Calibri" w:cs="Calibri"/>
+          <w:lang w:val="ru-RU"/>
+        </w:rPr>
+        <w:br/>
+      </w:r>
+      <w:r>
+        <w:rPr>
+          <w:rFonts w:ascii="Calibri" w:hAnsi="Calibri" w:cs="Calibri"/>
+          <w:lang w:val="ru-RU"/>
+        </w:rPr>
+        <w:t xml:space="preserve">Мальсагов, стр. </w:t>
+      </w:r>
+      <w:r>
+        <w:rPr>
+          <w:rFonts w:ascii="Calibri" w:hAnsi="Calibri" w:cs="Calibri"/>
+          <w:lang w:val="ru-RU"/>
+        </w:rPr>
+        <w:t>37</w:t>
+      </w:r>
+    </w:p>
+    <w:p>
+      <w:pPr>
         <w:rPr>
           <w:rFonts w:ascii="Calibri" w:hAnsi="Calibri" w:cs="Calibri"/>
           <w:lang w:val="ru-RU"/>
@@ -38565,12 +39522,20 @@
     </w:p>
     <w:p>
       <w:pPr>
+        <w:rPr>
+          <w:rFonts w:ascii="Calibri" w:hAnsi="Calibri" w:cs="Calibri"/>
+          <w:lang w:val="ru-RU"/>
+        </w:rPr>
+      </w:pPr>
+    </w:p>
+    <w:p>
+      <w:pPr>
         <w:pStyle w:val="Heading3"/>
         <w:rPr>
           <w:lang w:val="ru-RU"/>
         </w:rPr>
       </w:pPr>
-      <w:bookmarkStart w:id="53" w:name="_Toc232277881"/>
+      <w:bookmarkStart w:id="53" w:name="_Toc232277882"/>
       <w:r>
         <w:rPr>
           <w:rFonts w:ascii="Calibri" w:hAnsi="Calibri" w:cs="Calibri"/>
@@ -38582,27 +39547,34 @@
         <w:rPr>
           <w:lang w:val="ru-RU"/>
         </w:rPr>
-        <w:t xml:space="preserve"> 98 : </w:t>
-      </w:r>
-      <w:r>
-        <w:rPr>
-          <w:rFonts w:ascii="Calibri" w:hAnsi="Calibri" w:cs="Calibri"/>
-          <w:lang w:val="ru-RU"/>
-        </w:rPr>
-        <w:t>Ломо</w:t>
-      </w:r>
-      <w:r>
-        <w:rPr>
-          <w:lang w:val="ru-RU"/>
-        </w:rPr>
-        <w:t xml:space="preserve"> </w:t>
-      </w:r>
-      <w:r>
-        <w:rPr>
-          <w:rFonts w:ascii="Calibri" w:hAnsi="Calibri" w:cs="Calibri"/>
-          <w:lang w:val="ru-RU"/>
-        </w:rPr>
-        <w:t>берзага</w:t>
+        <w:t xml:space="preserve"> 107 : </w:t>
+      </w:r>
+      <w:r>
+        <w:rPr>
+          <w:rFonts w:ascii="Calibri" w:hAnsi="Calibri" w:cs="Calibri"/>
+          <w:lang w:val="ru-RU"/>
+        </w:rPr>
+        <w:t>Дахко</w:t>
+      </w:r>
+      <w:r>
+        <w:rPr>
+          <w:lang w:val="ru-RU"/>
+        </w:rPr>
+        <w:t xml:space="preserve"> </w:t>
+      </w:r>
+      <w:r>
+        <w:rPr>
+          <w:rFonts w:ascii="Calibri" w:hAnsi="Calibri" w:cs="Calibri"/>
+          <w:lang w:val="ru-RU"/>
+        </w:rPr>
+        <w:t>п</w:t>
+      </w:r>
+      <w:r>
+        <w:rPr>
+          <w:rFonts w:ascii="Calibri" w:hAnsi="Calibri" w:cs="Calibri"/>
+          <w:lang w:val="ru-RU"/>
+        </w:rPr>
+        <w:t>хьидага</w:t>
       </w:r>
       <w:r>
         <w:rPr>
@@ -38637,27 +39609,33 @@
         <w:rPr>
           <w:lang w:val="ru-RU"/>
         </w:rPr>
-        <w:t xml:space="preserve"> : </w:t>
-      </w:r>
-      <w:r>
-        <w:rPr>
-          <w:rFonts w:ascii="Calibri" w:hAnsi="Calibri" w:cs="Calibri"/>
-          <w:lang w:val="ru-RU"/>
-        </w:rPr>
-        <w:t>Отрицательные</w:t>
-      </w:r>
-      <w:r>
-        <w:rPr>
-          <w:lang w:val="ru-RU"/>
-        </w:rPr>
-        <w:t xml:space="preserve"> </w:t>
-      </w:r>
-      <w:r>
-        <w:rPr>
-          <w:rFonts w:ascii="Calibri" w:hAnsi="Calibri" w:cs="Calibri"/>
-          <w:lang w:val="ru-RU"/>
-        </w:rPr>
-        <w:t>местоимения</w:t>
+        <w:t xml:space="preserve">: </w:t>
+      </w:r>
+      <w:r>
+        <w:rPr>
+          <w:rFonts w:ascii="Calibri" w:hAnsi="Calibri" w:cs="Calibri"/>
+          <w:lang w:val="ru-RU"/>
+        </w:rPr>
+        <w:t>Кратные</w:t>
+      </w:r>
+      <w:r>
+        <w:rPr>
+          <w:lang w:val="ru-RU"/>
+        </w:rPr>
+        <w:t xml:space="preserve"> </w:t>
+      </w:r>
+      <w:r>
+        <w:rPr>
+          <w:rFonts w:ascii="Calibri" w:hAnsi="Calibri" w:cs="Calibri"/>
+          <w:lang w:val="ru-RU"/>
+        </w:rPr>
+        <w:t>числительные</w:t>
+      </w:r>
+      <w:r>
+        <w:rPr>
+          <w:lang w:val="ru-RU"/>
+        </w:rPr>
+        <w:t xml:space="preserve"> </w:t>
       </w:r>
     </w:p>
     <w:p>
@@ -38672,13 +39650,7 @@
           <w:rFonts w:ascii="Calibri" w:hAnsi="Calibri" w:cs="Calibri"/>
           <w:lang w:val="ru-RU"/>
         </w:rPr>
-        <w:t>х1ама а</w:t>
-      </w:r>
-      <w:r>
-        <w:rPr>
-          <w:rFonts w:ascii="Calibri" w:hAnsi="Calibri" w:cs="Calibri"/>
-        </w:rPr>
-        <w:t> </w:t>
+        <w:t>шозза-кхозза яхар</w:t>
       </w:r>
       <w:r>
         <w:rPr>
@@ -38686,83 +39658,50 @@
           <w:lang w:val="ru-RU"/>
         </w:rPr>
         <w:br/>
-        <w:t>М</w:t>
-      </w:r>
-      <w:r>
-        <w:rPr>
-          <w:rFonts w:ascii="Calibri" w:hAnsi="Calibri" w:cs="Calibri"/>
-          <w:lang w:val="ru-RU"/>
-        </w:rPr>
-        <w:t>ациев стр. 589</w:t>
-      </w:r>
-      <w:r>
-        <w:rPr>
-          <w:rFonts w:ascii="Calibri" w:hAnsi="Calibri" w:cs="Calibri"/>
-          <w:lang w:val="ru-RU"/>
-        </w:rPr>
-        <w:br/>
+      </w:r>
+      <w:r>
+        <w:rPr>
+          <w:rFonts w:ascii="Calibri" w:hAnsi="Calibri" w:cs="Calibri"/>
+          <w:lang w:val="ru-RU"/>
+        </w:rPr>
+        <w:t xml:space="preserve">Мальсагов 34 ; </w:t>
+      </w:r>
+      <w:r>
+        <w:rPr>
+          <w:rFonts w:ascii="Calibri" w:hAnsi="Calibri" w:cs="Calibri"/>
+          <w:lang w:val="ru-RU"/>
+        </w:rPr>
+        <w:t>Мациев стр. 585</w:t>
       </w:r>
     </w:p>
     <w:p>
       <w:pPr>
         <w:pStyle w:val="Heading3"/>
         <w:rPr>
-          <w:lang w:val="ru-RU"/>
+          <w:rFonts w:ascii="Calibri" w:hAnsi="Calibri" w:cs="Calibri"/>
+          <w:lang w:val="ce-Cyrl-RU"/>
         </w:rPr>
       </w:pPr>
-      <w:bookmarkStart w:id="54" w:name="_Toc232277882"/>
-      <w:r>
-        <w:rPr>
-          <w:rFonts w:ascii="Calibri" w:hAnsi="Calibri" w:cs="Calibri"/>
-          <w:lang w:val="ru-RU"/>
+      <w:bookmarkStart w:id="54" w:name="_Toc232277883"/>
+      <w:r>
+        <w:rPr>
+          <w:rFonts w:ascii="Calibri" w:hAnsi="Calibri" w:cs="Calibri"/>
+          <w:lang w:val="ce-Cyrl-RU"/>
         </w:rPr>
         <w:t>Притча</w:t>
       </w:r>
       <w:r>
         <w:rPr>
-          <w:lang w:val="ru-RU"/>
-        </w:rPr>
-        <w:t xml:space="preserve"> 107 : </w:t>
-      </w:r>
-      <w:r>
-        <w:rPr>
-          <w:rFonts w:ascii="Calibri" w:hAnsi="Calibri" w:cs="Calibri"/>
-          <w:lang w:val="ru-RU"/>
-        </w:rPr>
-        <w:t>Дахко</w:t>
-      </w:r>
-      <w:r>
-        <w:rPr>
-          <w:lang w:val="ru-RU"/>
-        </w:rPr>
-        <w:t xml:space="preserve"> </w:t>
-      </w:r>
-      <w:r>
-        <w:rPr>
-          <w:rFonts w:ascii="Calibri" w:hAnsi="Calibri" w:cs="Calibri"/>
-          <w:lang w:val="ru-RU"/>
-        </w:rPr>
-        <w:t>п</w:t>
-      </w:r>
-      <w:r>
-        <w:rPr>
-          <w:rFonts w:ascii="Calibri" w:hAnsi="Calibri" w:cs="Calibri"/>
-          <w:lang w:val="ru-RU"/>
-        </w:rPr>
-        <w:t>хьидага</w:t>
-      </w:r>
-      <w:r>
-        <w:rPr>
-          <w:lang w:val="ru-RU"/>
-        </w:rPr>
-        <w:t xml:space="preserve"> </w:t>
-      </w:r>
-      <w:r>
-        <w:rPr>
-          <w:rFonts w:ascii="Calibri" w:hAnsi="Calibri" w:cs="Calibri"/>
-          <w:lang w:val="ru-RU"/>
-        </w:rPr>
-        <w:t>аьннар</w:t>
+          <w:lang w:val="ce-Cyrl-RU"/>
+        </w:rPr>
+        <w:t xml:space="preserve"> 111 : </w:t>
+      </w:r>
+      <w:r>
+        <w:rPr>
+          <w:rFonts w:ascii="Calibri" w:hAnsi="Calibri" w:cs="Calibri"/>
+          <w:lang w:val="ce-Cyrl-RU"/>
+        </w:rPr>
+        <w:t>Хьурмат дар</w:t>
       </w:r>
       <w:bookmarkEnd w:id="54"/>
     </w:p>
@@ -38770,70 +39709,108 @@
       <w:pPr>
         <w:pStyle w:val="Heading4"/>
         <w:rPr>
-          <w:lang w:val="ru-RU"/>
+          <w:rFonts w:ascii="Calibri" w:hAnsi="Calibri" w:cs="Calibri"/>
+          <w:lang w:val="ce-Cyrl-RU"/>
         </w:rPr>
       </w:pPr>
       <w:r>
         <w:rPr>
           <w:rFonts w:ascii="Calibri" w:hAnsi="Calibri" w:cs="Calibri"/>
-          <w:lang w:val="ru-RU"/>
+          <w:lang w:val="ce-Cyrl-RU"/>
         </w:rPr>
         <w:t>Грамматика</w:t>
       </w:r>
       <w:r>
         <w:rPr>
-          <w:lang w:val="ru-RU"/>
-        </w:rPr>
-        <w:t xml:space="preserve">: </w:t>
-      </w:r>
-      <w:r>
-        <w:rPr>
-          <w:rFonts w:ascii="Calibri" w:hAnsi="Calibri" w:cs="Calibri"/>
-          <w:lang w:val="ru-RU"/>
-        </w:rPr>
-        <w:t>Кратные</w:t>
-      </w:r>
-      <w:r>
-        <w:rPr>
-          <w:lang w:val="ru-RU"/>
-        </w:rPr>
-        <w:t xml:space="preserve"> </w:t>
-      </w:r>
-      <w:r>
-        <w:rPr>
-          <w:rFonts w:ascii="Calibri" w:hAnsi="Calibri" w:cs="Calibri"/>
-          <w:lang w:val="ru-RU"/>
+          <w:lang w:val="ce-Cyrl-RU"/>
+        </w:rPr>
+        <w:t xml:space="preserve"> : </w:t>
+      </w:r>
+      <w:r>
+        <w:rPr>
+          <w:rFonts w:ascii="Calibri" w:hAnsi="Calibri" w:cs="Calibri"/>
+          <w:lang w:val="ce-Cyrl-RU"/>
+        </w:rPr>
+        <w:t>дробные</w:t>
+      </w:r>
+      <w:r>
+        <w:rPr>
+          <w:lang w:val="ce-Cyrl-RU"/>
+        </w:rPr>
+        <w:t xml:space="preserve"> </w:t>
+      </w:r>
+      <w:r>
+        <w:rPr>
+          <w:rFonts w:ascii="Calibri" w:hAnsi="Calibri" w:cs="Calibri"/>
+          <w:lang w:val="ce-Cyrl-RU"/>
         </w:rPr>
         <w:t>числительные</w:t>
-      </w:r>
-      <w:r>
-        <w:rPr>
-          <w:lang w:val="ru-RU"/>
-        </w:rPr>
-        <w:t xml:space="preserve"> </w:t>
       </w:r>
     </w:p>
     <w:p>
       <w:pPr>
         <w:rPr>
-          <w:rFonts w:ascii="Calibri" w:hAnsi="Calibri" w:cs="Calibri"/>
-          <w:lang w:val="ru-RU"/>
+          <w:lang w:val="ce-Cyrl-RU"/>
         </w:rPr>
       </w:pPr>
       <w:r>
         <w:rPr>
           <w:rFonts w:ascii="Calibri" w:hAnsi="Calibri" w:cs="Calibri"/>
-          <w:lang w:val="ru-RU"/>
-        </w:rPr>
-        <w:t>шозза-кхозза яхар</w:t>
-      </w:r>
-      <w:r>
-        <w:rPr>
-          <w:rFonts w:ascii="Calibri" w:hAnsi="Calibri" w:cs="Calibri"/>
-          <w:lang w:val="ru-RU"/>
+          <w:lang w:val="ce-Cyrl-RU"/>
+        </w:rPr>
+        <w:t>Ах</w:t>
+      </w:r>
+      <w:r>
+        <w:rPr>
+          <w:lang w:val="ce-Cyrl-RU"/>
+        </w:rPr>
+        <w:t xml:space="preserve"> </w:t>
+      </w:r>
+      <w:r>
+        <w:rPr>
+          <w:rFonts w:ascii="Calibri" w:hAnsi="Calibri" w:cs="Calibri"/>
+          <w:lang w:val="ce-Cyrl-RU"/>
+        </w:rPr>
+        <w:t>фийг</w:t>
+      </w:r>
+      <w:r>
+        <w:rPr>
+          <w:lang w:val="ce-Cyrl-RU"/>
         </w:rPr>
         <w:br/>
-        <w:t>Мациев стр. 585</w:t>
+      </w:r>
+      <w:r>
+        <w:rPr>
+          <w:rFonts w:ascii="Calibri" w:hAnsi="Calibri" w:cs="Calibri"/>
+          <w:lang w:val="ce-Cyrl-RU"/>
+        </w:rPr>
+        <w:t xml:space="preserve">Мальсагов стр. 34 ; </w:t>
+      </w:r>
+      <w:r>
+        <w:rPr>
+          <w:rFonts w:ascii="Calibri" w:hAnsi="Calibri" w:cs="Calibri"/>
+          <w:lang w:val="ce-Cyrl-RU"/>
+        </w:rPr>
+        <w:t>Мациев</w:t>
+      </w:r>
+      <w:r>
+        <w:rPr>
+          <w:lang w:val="ce-Cyrl-RU"/>
+        </w:rPr>
+        <w:t xml:space="preserve"> </w:t>
+      </w:r>
+      <w:r>
+        <w:rPr>
+          <w:rFonts w:ascii="Calibri" w:hAnsi="Calibri" w:cs="Calibri"/>
+          <w:lang w:val="ce-Cyrl-RU"/>
+        </w:rPr>
+        <w:t>стр</w:t>
+      </w:r>
+      <w:r>
+        <w:rPr>
+          <w:lang w:val="ce-Cyrl-RU"/>
+        </w:rPr>
+        <w:t>. 584</w:t>
       </w:r>
     </w:p>
     <w:p>
@@ -38844,7 +39821,7 @@
           <w:lang w:val="ce-Cyrl-RU"/>
         </w:rPr>
       </w:pPr>
-      <w:bookmarkStart w:id="55" w:name="_Toc232277883"/>
+      <w:bookmarkStart w:id="55" w:name="_Toc232277884"/>
       <w:r>
         <w:rPr>
           <w:rFonts w:ascii="Calibri" w:hAnsi="Calibri" w:cs="Calibri"/>
@@ -38856,14 +39833,14 @@
         <w:rPr>
           <w:lang w:val="ce-Cyrl-RU"/>
         </w:rPr>
-        <w:t xml:space="preserve"> 111 : </w:t>
-      </w:r>
-      <w:r>
-        <w:rPr>
-          <w:rFonts w:ascii="Calibri" w:hAnsi="Calibri" w:cs="Calibri"/>
-          <w:lang w:val="ce-Cyrl-RU"/>
-        </w:rPr>
-        <w:t>Хьурмат дар</w:t>
+        <w:t xml:space="preserve"> 114 : </w:t>
+      </w:r>
+      <w:r>
+        <w:rPr>
+          <w:rFonts w:ascii="Calibri" w:hAnsi="Calibri" w:cs="Calibri"/>
+          <w:lang w:val="ce-Cyrl-RU"/>
+        </w:rPr>
+        <w:t>Боарам боацаш я сага сутарал</w:t>
       </w:r>
       <w:bookmarkEnd w:id="55"/>
     </w:p>
@@ -38893,20 +39870,7 @@
           <w:rFonts w:ascii="Calibri" w:hAnsi="Calibri" w:cs="Calibri"/>
           <w:lang w:val="ce-Cyrl-RU"/>
         </w:rPr>
-        <w:t>дробные</w:t>
-      </w:r>
-      <w:r>
-        <w:rPr>
-          <w:lang w:val="ce-Cyrl-RU"/>
-        </w:rPr>
-        <w:t xml:space="preserve"> </w:t>
-      </w:r>
-      <w:r>
-        <w:rPr>
-          <w:rFonts w:ascii="Calibri" w:hAnsi="Calibri" w:cs="Calibri"/>
-          <w:lang w:val="ce-Cyrl-RU"/>
-        </w:rPr>
-        <w:t>числительные</w:t>
+        <w:t>Признаки, по которым можно определить класс существительных</w:t>
       </w:r>
     </w:p>
     <w:p>
@@ -38918,22 +39882,11 @@
       <w:r>
         <w:rPr>
           <w:rFonts w:ascii="Calibri" w:hAnsi="Calibri" w:cs="Calibri"/>
-          <w:lang w:val="ce-Cyrl-RU"/>
-        </w:rPr>
-        <w:t>Ах</w:t>
-      </w:r>
-      <w:r>
-        <w:rPr>
-          <w:lang w:val="ce-Cyrl-RU"/>
-        </w:rPr>
-        <w:t xml:space="preserve"> </w:t>
-      </w:r>
-      <w:r>
-        <w:rPr>
-          <w:rFonts w:ascii="Calibri" w:hAnsi="Calibri" w:cs="Calibri"/>
-          <w:lang w:val="ce-Cyrl-RU"/>
-        </w:rPr>
-        <w:t>фийг</w:t>
+          <w:i/>
+          <w:iCs/>
+          <w:lang w:val="ce-Cyrl-RU"/>
+        </w:rPr>
+        <w:t>сутарал, ц1арматал</w:t>
       </w:r>
       <w:r>
         <w:rPr>
@@ -38946,7 +39899,7 @@
           <w:rFonts w:ascii="Calibri" w:hAnsi="Calibri" w:cs="Calibri"/>
           <w:lang w:val="ce-Cyrl-RU"/>
         </w:rPr>
-        <w:t>Мациев</w:t>
+        <w:t>Мальсагов,</w:t>
       </w:r>
       <w:r>
         <w:rPr>
@@ -38965,7 +39918,7 @@
         <w:rPr>
           <w:lang w:val="ce-Cyrl-RU"/>
         </w:rPr>
-        <w:t>. 584</w:t>
+        <w:t>. 15</w:t>
       </w:r>
     </w:p>
     <w:p>
@@ -38976,7 +39929,6 @@
           <w:lang w:val="ce-Cyrl-RU"/>
         </w:rPr>
       </w:pPr>
-      <w:bookmarkStart w:id="56" w:name="_Toc232277884"/>
       <w:r>
         <w:rPr>
           <w:rFonts w:ascii="Calibri" w:hAnsi="Calibri" w:cs="Calibri"/>
@@ -38988,14 +39940,118 @@
         <w:rPr>
           <w:lang w:val="ce-Cyrl-RU"/>
         </w:rPr>
-        <w:t xml:space="preserve"> 114 : </w:t>
-      </w:r>
-      <w:r>
-        <w:rPr>
-          <w:rFonts w:ascii="Calibri" w:hAnsi="Calibri" w:cs="Calibri"/>
-          <w:lang w:val="ce-Cyrl-RU"/>
-        </w:rPr>
-        <w:t>Боарам боацаш я сага сутарал</w:t>
+        <w:t xml:space="preserve"> 1</w:t>
+      </w:r>
+      <w:r>
+        <w:rPr>
+          <w:lang w:val="ce-Cyrl-RU"/>
+        </w:rPr>
+        <w:t>21</w:t>
+      </w:r>
+      <w:r>
+        <w:rPr>
+          <w:lang w:val="ce-Cyrl-RU"/>
+        </w:rPr>
+        <w:t xml:space="preserve"> : </w:t>
+      </w:r>
+      <w:r>
+        <w:rPr>
+          <w:rFonts w:ascii="Calibri" w:hAnsi="Calibri" w:cs="Calibri"/>
+          <w:lang w:val="ce-Cyrl-RU"/>
+        </w:rPr>
+        <w:t>Ийрча когаши хоза кури</w:t>
+      </w:r>
+    </w:p>
+    <w:p>
+      <w:pPr>
+        <w:pStyle w:val="Heading4"/>
+        <w:rPr>
+          <w:rFonts w:ascii="Calibri" w:hAnsi="Calibri" w:cs="Calibri"/>
+          <w:lang w:val="ce-Cyrl-RU"/>
+        </w:rPr>
+      </w:pPr>
+      <w:r>
+        <w:rPr>
+          <w:rFonts w:ascii="Calibri" w:hAnsi="Calibri" w:cs="Calibri"/>
+          <w:lang w:val="ce-Cyrl-RU"/>
+        </w:rPr>
+        <w:t>Грамматика</w:t>
+      </w:r>
+      <w:r>
+        <w:rPr>
+          <w:lang w:val="ce-Cyrl-RU"/>
+        </w:rPr>
+        <w:t xml:space="preserve"> : </w:t>
+      </w:r>
+      <w:r>
+        <w:rPr>
+          <w:rFonts w:ascii="Calibri" w:hAnsi="Calibri" w:cs="Calibri"/>
+          <w:lang w:val="ce-Cyrl-RU"/>
+        </w:rPr>
+        <w:t>Перечисление</w:t>
+      </w:r>
+    </w:p>
+    <w:p>
+      <w:pPr>
+        <w:rPr>
+          <w:lang w:val="en-US"/>
+        </w:rPr>
+      </w:pPr>
+      <w:r>
+        <w:rPr>
+          <w:rFonts w:ascii="Calibri" w:hAnsi="Calibri" w:cs="Calibri"/>
+          <w:lang w:val="ce-Cyrl-RU"/>
+        </w:rPr>
+        <w:t>Мальсагов</w:t>
+      </w:r>
+      <w:r>
+        <w:rPr>
+          <w:lang w:val="ce-Cyrl-RU"/>
+        </w:rPr>
+        <w:t xml:space="preserve">, </w:t>
+      </w:r>
+      <w:r>
+        <w:rPr>
+          <w:rFonts w:ascii="Calibri" w:hAnsi="Calibri" w:cs="Calibri"/>
+          <w:lang w:val="ce-Cyrl-RU"/>
+        </w:rPr>
+        <w:t>стр</w:t>
+      </w:r>
+      <w:r>
+        <w:rPr>
+          <w:lang w:val="ce-Cyrl-RU"/>
+        </w:rPr>
+        <w:t>. 75</w:t>
+      </w:r>
+    </w:p>
+    <w:p>
+      <w:pPr>
+        <w:pStyle w:val="Heading3"/>
+        <w:rPr>
+          <w:rFonts w:ascii="Calibri" w:hAnsi="Calibri" w:cs="Calibri"/>
+          <w:lang w:val="ce-Cyrl-RU"/>
+        </w:rPr>
+      </w:pPr>
+      <w:bookmarkStart w:id="56" w:name="_Toc232277885"/>
+      <w:r>
+        <w:rPr>
+          <w:rFonts w:ascii="Calibri" w:hAnsi="Calibri" w:cs="Calibri"/>
+          <w:lang w:val="ce-Cyrl-RU"/>
+        </w:rPr>
+        <w:t>Притча</w:t>
+      </w:r>
+      <w:r>
+        <w:rPr>
+          <w:lang w:val="ce-Cyrl-RU"/>
+        </w:rPr>
+        <w:t xml:space="preserve"> 140 : </w:t>
+      </w:r>
+      <w:r>
+        <w:rPr>
+          <w:rFonts w:ascii="Calibri" w:hAnsi="Calibri" w:cs="Calibri"/>
+          <w:lang w:val="ce-Cyrl-RU"/>
+        </w:rPr>
+        <w:t>Чано аьннар</w:t>
       </w:r>
       <w:bookmarkEnd w:id="56"/>
     </w:p>
@@ -39025,7 +40081,14 @@
           <w:rFonts w:ascii="Calibri" w:hAnsi="Calibri" w:cs="Calibri"/>
           <w:lang w:val="ce-Cyrl-RU"/>
         </w:rPr>
-        <w:t>Признаки, по которым можно определить класс существительных</w:t>
+        <w:t>Двойственное число</w:t>
+      </w:r>
+      <w:r>
+        <w:rPr>
+          <w:rFonts w:ascii="Calibri" w:hAnsi="Calibri" w:cs="Calibri"/>
+          <w:lang w:val="ce-Cyrl-RU"/>
+        </w:rPr>
+        <w:t xml:space="preserve"> (дуалис)</w:t>
       </w:r>
     </w:p>
     <w:p>
@@ -39037,183 +40100,195 @@
       <w:r>
         <w:rPr>
           <w:rFonts w:ascii="Calibri" w:hAnsi="Calibri" w:cs="Calibri"/>
-          <w:i/>
-          <w:iCs/>
-          <w:lang w:val="ce-Cyrl-RU"/>
-        </w:rPr>
-        <w:t>сутарал, ц1арматал</w:t>
-      </w:r>
-      <w:r>
-        <w:rPr>
+          <w:lang w:val="ce-Cyrl-RU"/>
+        </w:rPr>
+        <w:t>“</w:t>
+      </w:r>
+      <w:r>
+        <w:rPr>
+          <w:rFonts w:ascii="Calibri" w:hAnsi="Calibri" w:cs="Calibri"/>
+          <w:lang w:val="ce-Cyrl-RU"/>
+        </w:rPr>
+        <w:t>Вай шиъ в1аший кхы тарлургвац</w:t>
+      </w:r>
+      <w:r>
+        <w:rPr>
+          <w:rFonts w:ascii="Calibri" w:hAnsi="Calibri" w:cs="Calibri"/>
+          <w:lang w:val="ce-Cyrl-RU"/>
+        </w:rPr>
+        <w:t>”</w:t>
+      </w:r>
+      <w:r>
+        <w:rPr>
+          <w:rFonts w:ascii="Calibri" w:hAnsi="Calibri" w:cs="Calibri"/>
           <w:lang w:val="ce-Cyrl-RU"/>
         </w:rPr>
         <w:br/>
-      </w:r>
-      <w:r>
-        <w:rPr>
-          <w:rFonts w:ascii="Calibri" w:hAnsi="Calibri" w:cs="Calibri"/>
-          <w:lang w:val="ce-Cyrl-RU"/>
-        </w:rPr>
-        <w:t>Мальсагов,</w:t>
-      </w:r>
-      <w:r>
-        <w:rPr>
-          <w:lang w:val="ce-Cyrl-RU"/>
-        </w:rPr>
-        <w:t xml:space="preserve"> </w:t>
-      </w:r>
-      <w:r>
-        <w:rPr>
-          <w:rFonts w:ascii="Calibri" w:hAnsi="Calibri" w:cs="Calibri"/>
-          <w:lang w:val="ce-Cyrl-RU"/>
-        </w:rPr>
-        <w:t>стр</w:t>
-      </w:r>
-      <w:r>
-        <w:rPr>
-          <w:lang w:val="ce-Cyrl-RU"/>
-        </w:rPr>
-        <w:t>. 15</w:t>
+        <w:t>В ингушском нет двойственного числа в классическом понимании, тем не менее, когда речь идет о двух людях, для них всегда используются отдельные формы местоимений</w:t>
+      </w:r>
+      <w:r>
+        <w:rPr>
+          <w:rFonts w:ascii="Calibri" w:hAnsi="Calibri" w:cs="Calibri"/>
+          <w:lang w:val="ce-Cyrl-RU"/>
+        </w:rPr>
+        <w:t xml:space="preserve"> – вай шиъ, тхо шиъ, шу шиъ, уж шиъ</w:t>
+      </w:r>
+      <w:r>
+        <w:rPr>
+          <w:rFonts w:ascii="Calibri" w:hAnsi="Calibri" w:cs="Calibri"/>
+          <w:lang w:val="ce-Cyrl-RU"/>
+        </w:rPr>
+        <w:t>.</w:t>
+      </w:r>
+      <w:r>
+        <w:rPr>
+          <w:rFonts w:ascii="Calibri" w:hAnsi="Calibri" w:cs="Calibri"/>
+          <w:lang w:val="ce-Cyrl-RU"/>
+        </w:rPr>
+        <w:br/>
+        <w:t>Если бы он сказал : “Вай в1аший кхы тарлургдац”, это звучало бы неестественно.</w:t>
+      </w:r>
+      <w:r>
+        <w:rPr>
+          <w:rFonts w:ascii="Calibri" w:hAnsi="Calibri" w:cs="Calibri"/>
+          <w:lang w:val="ce-Cyrl-RU"/>
+        </w:rPr>
+        <w:br/>
+        <w:t>Обратите также внимание на использование различных классных показателей для двух людей и для группы людей: “вай шиъ тарлургвац” и “вай тарлургдац”.</w:t>
+      </w:r>
+      <w:r>
+        <w:rPr>
+          <w:lang w:val="ce-Cyrl-RU"/>
+        </w:rPr>
+        <w:br/>
       </w:r>
     </w:p>
     <w:p>
       <w:pPr>
         <w:pStyle w:val="Heading3"/>
         <w:rPr>
-          <w:rFonts w:ascii="Calibri" w:hAnsi="Calibri" w:cs="Calibri"/>
-          <w:lang w:val="ce-Cyrl-RU"/>
+          <w:lang w:val="ru-RU"/>
         </w:rPr>
       </w:pPr>
-      <w:bookmarkStart w:id="57" w:name="_Toc232277885"/>
-      <w:r>
-        <w:rPr>
-          <w:rFonts w:ascii="Calibri" w:hAnsi="Calibri" w:cs="Calibri"/>
-          <w:lang w:val="ce-Cyrl-RU"/>
+      <w:bookmarkStart w:id="57" w:name="_Toc232277881"/>
+      <w:r>
+        <w:rPr>
+          <w:rFonts w:ascii="Calibri" w:hAnsi="Calibri" w:cs="Calibri"/>
+          <w:lang w:val="ru-RU"/>
         </w:rPr>
         <w:t>Притча</w:t>
       </w:r>
       <w:r>
         <w:rPr>
-          <w:lang w:val="ce-Cyrl-RU"/>
-        </w:rPr>
-        <w:t xml:space="preserve"> 140 : </w:t>
-      </w:r>
-      <w:r>
-        <w:rPr>
-          <w:rFonts w:ascii="Calibri" w:hAnsi="Calibri" w:cs="Calibri"/>
-          <w:lang w:val="ce-Cyrl-RU"/>
-        </w:rPr>
-        <w:t>Чано аьннар</w:t>
+          <w:lang w:val="ru-RU"/>
+        </w:rPr>
+        <w:t xml:space="preserve"> </w:t>
+      </w:r>
+      <w:r>
+        <w:rPr>
+          <w:lang w:val="ru-RU"/>
+        </w:rPr>
+        <w:t>157</w:t>
+      </w:r>
+      <w:r>
+        <w:rPr>
+          <w:lang w:val="ru-RU"/>
+        </w:rPr>
+        <w:t xml:space="preserve"> : </w:t>
       </w:r>
       <w:bookmarkEnd w:id="57"/>
+      <w:r>
+        <w:rPr>
+          <w:rFonts w:ascii="Calibri" w:hAnsi="Calibri" w:cs="Calibri"/>
+          <w:lang w:val="ru-RU"/>
+        </w:rPr>
+        <w:t>Цу тайпара саг хила йиш яц</w:t>
+      </w:r>
     </w:p>
     <w:p>
       <w:pPr>
         <w:pStyle w:val="Heading4"/>
         <w:rPr>
-          <w:rFonts w:ascii="Calibri" w:hAnsi="Calibri" w:cs="Calibri"/>
-          <w:lang w:val="ce-Cyrl-RU"/>
+          <w:lang w:val="ru-RU"/>
         </w:rPr>
       </w:pPr>
       <w:r>
         <w:rPr>
           <w:rFonts w:ascii="Calibri" w:hAnsi="Calibri" w:cs="Calibri"/>
-          <w:lang w:val="ce-Cyrl-RU"/>
+          <w:lang w:val="ru-RU"/>
         </w:rPr>
         <w:t>Грамматика</w:t>
       </w:r>
       <w:r>
         <w:rPr>
-          <w:lang w:val="ce-Cyrl-RU"/>
+          <w:lang w:val="ru-RU"/>
         </w:rPr>
         <w:t xml:space="preserve"> : </w:t>
       </w:r>
       <w:r>
         <w:rPr>
           <w:rFonts w:ascii="Calibri" w:hAnsi="Calibri" w:cs="Calibri"/>
-          <w:lang w:val="ce-Cyrl-RU"/>
-        </w:rPr>
-        <w:t>Двойственное число</w:t>
-      </w:r>
-      <w:r>
-        <w:rPr>
-          <w:rFonts w:ascii="Calibri" w:hAnsi="Calibri" w:cs="Calibri"/>
-          <w:lang w:val="ce-Cyrl-RU"/>
-        </w:rPr>
-        <w:t xml:space="preserve"> (дуалис)</w:t>
+          <w:lang w:val="ru-RU"/>
+        </w:rPr>
+        <w:t>Отрицательные</w:t>
+      </w:r>
+      <w:r>
+        <w:rPr>
+          <w:lang w:val="ru-RU"/>
+        </w:rPr>
+        <w:t xml:space="preserve"> </w:t>
+      </w:r>
+      <w:r>
+        <w:rPr>
+          <w:rFonts w:ascii="Calibri" w:hAnsi="Calibri" w:cs="Calibri"/>
+          <w:lang w:val="ru-RU"/>
+        </w:rPr>
+        <w:t>местоимения</w:t>
       </w:r>
     </w:p>
     <w:p>
       <w:pPr>
         <w:rPr>
-          <w:lang w:val="ce-Cyrl-RU"/>
+          <w:rFonts w:ascii="Calibri" w:hAnsi="Calibri" w:cs="Calibri"/>
+          <w:lang w:val="ru-RU"/>
         </w:rPr>
       </w:pPr>
       <w:r>
         <w:rPr>
           <w:rFonts w:ascii="Calibri" w:hAnsi="Calibri" w:cs="Calibri"/>
-          <w:lang w:val="ce-Cyrl-RU"/>
-        </w:rPr>
-        <w:t>“</w:t>
-      </w:r>
-      <w:r>
-        <w:rPr>
-          <w:rFonts w:ascii="Calibri" w:hAnsi="Calibri" w:cs="Calibri"/>
-          <w:lang w:val="ce-Cyrl-RU"/>
-        </w:rPr>
-        <w:t>Вай шиъ в1аший кхы тарлургвац</w:t>
-      </w:r>
-      <w:r>
-        <w:rPr>
-          <w:rFonts w:ascii="Calibri" w:hAnsi="Calibri" w:cs="Calibri"/>
-          <w:lang w:val="ce-Cyrl-RU"/>
-        </w:rPr>
-        <w:t>”</w:t>
-      </w:r>
-      <w:r>
-        <w:rPr>
-          <w:rFonts w:ascii="Calibri" w:hAnsi="Calibri" w:cs="Calibri"/>
-          <w:lang w:val="ce-Cyrl-RU"/>
+          <w:lang w:val="ru-RU"/>
+        </w:rPr>
+        <w:t>х1ама а</w:t>
+      </w:r>
+      <w:r>
+        <w:rPr>
+          <w:rFonts w:ascii="Calibri" w:hAnsi="Calibri" w:cs="Calibri"/>
+          <w:lang w:val="ru-RU"/>
+        </w:rPr>
+        <w:t>, цхьаккха х1ама</w:t>
+      </w:r>
+      <w:r>
+        <w:rPr>
+          <w:rFonts w:ascii="Calibri" w:hAnsi="Calibri" w:cs="Calibri"/>
+          <w:lang w:val="ru-RU"/>
         </w:rPr>
         <w:br/>
-        <w:t>В ингушском нет двойственного числа в классическом понимании, тем не менее, когда речь идет о двух людях, для них всегда используются отдельные формы местоимений</w:t>
-      </w:r>
-      <w:r>
-        <w:rPr>
-          <w:rFonts w:ascii="Calibri" w:hAnsi="Calibri" w:cs="Calibri"/>
-          <w:lang w:val="ce-Cyrl-RU"/>
-        </w:rPr>
-        <w:t xml:space="preserve"> – вай шиъ, тхо шиъ, шу шиъ, уж шиъ</w:t>
-      </w:r>
-      <w:r>
-        <w:rPr>
-          <w:rFonts w:ascii="Calibri" w:hAnsi="Calibri" w:cs="Calibri"/>
-          <w:lang w:val="ce-Cyrl-RU"/>
-        </w:rPr>
-        <w:t>.</w:t>
-      </w:r>
-      <w:r>
-        <w:rPr>
-          <w:rFonts w:ascii="Calibri" w:hAnsi="Calibri" w:cs="Calibri"/>
-          <w:lang w:val="ce-Cyrl-RU"/>
-        </w:rPr>
-        <w:br/>
-        <w:t>Если бы он сказал : “Вай в1аший кхы тарлургдац”, это звучало бы неестественно.</w:t>
-      </w:r>
-      <w:r>
-        <w:rPr>
-          <w:rFonts w:ascii="Calibri" w:hAnsi="Calibri" w:cs="Calibri"/>
-          <w:lang w:val="ce-Cyrl-RU"/>
-        </w:rPr>
-        <w:br/>
-        <w:t>Обратите также внимание на использование различных классных показателей для двух людей и для группы людей: “вай шиъ тарлургвац” и “вай тарлургдац”.</w:t>
-      </w:r>
-      <w:r>
-        <w:rPr>
-          <w:lang w:val="ce-Cyrl-RU"/>
-        </w:rPr>
-        <w:br/>
-      </w:r>
+        <w:t>М</w:t>
+      </w:r>
+      <w:r>
+        <w:rPr>
+          <w:rFonts w:ascii="Calibri" w:hAnsi="Calibri" w:cs="Calibri"/>
+          <w:lang w:val="ru-RU"/>
+        </w:rPr>
+        <w:t>ациев стр. 589</w:t>
+      </w:r>
+    </w:p>
+    <w:p>
+      <w:pPr>
+        <w:rPr>
+          <w:lang w:val="ce-Cyrl-RU"/>
+        </w:rPr>
+      </w:pPr>
     </w:p>
     <w:p>
       <w:pPr>
@@ -39455,7 +40530,7 @@
       <w:pPr>
         <w:rPr>
           <w:rFonts w:ascii="Calibri" w:hAnsi="Calibri" w:cs="Calibri"/>
-          <w:lang w:val="en-US"/>
+          <w:lang w:val="ru-RU"/>
         </w:rPr>
       </w:pPr>
       <w:r>
@@ -39463,12 +40538,19 @@
           <w:rFonts w:ascii="Calibri" w:hAnsi="Calibri" w:cs="Calibri"/>
           <w:lang w:val="ru-RU"/>
         </w:rPr>
+        <w:t xml:space="preserve">Мальсагов стр. 34 ; </w:t>
+      </w:r>
+      <w:r>
+        <w:rPr>
+          <w:rFonts w:ascii="Calibri" w:hAnsi="Calibri" w:cs="Calibri"/>
+          <w:lang w:val="ru-RU"/>
+        </w:rPr>
         <w:t>Мациев</w:t>
       </w:r>
       <w:r>
         <w:rPr>
           <w:rFonts w:ascii="Calibri" w:hAnsi="Calibri" w:cs="Calibri"/>
-          <w:lang w:val="en-US"/>
+          <w:lang w:val="ru-RU"/>
         </w:rPr>
         <w:t xml:space="preserve"> </w:t>
       </w:r>
@@ -39482,7 +40564,7 @@
       <w:r>
         <w:rPr>
           <w:rFonts w:ascii="Calibri" w:hAnsi="Calibri" w:cs="Calibri"/>
-          <w:lang w:val="en-US"/>
+          <w:lang w:val="ru-RU"/>
         </w:rPr>
         <w:t>. 582</w:t>
       </w:r>
@@ -39499,12 +40581,21 @@
       <w:pPr>
         <w:rPr>
           <w:rFonts w:ascii="Calibri" w:hAnsi="Calibri" w:cs="Calibri"/>
-          <w:lang w:val="en-US"/>
+          <w:lang w:val="ru-RU"/>
         </w:rPr>
       </w:pPr>
     </w:p>
     <w:sdt>
       <w:sdtPr>
+        <w:rPr>
+          <w:rFonts w:asciiTheme="minorHAnsi" w:eastAsiaTheme="minorHAnsi" w:hAnsiTheme="minorHAnsi" w:cstheme="minorBidi"/>
+          <w:color w:val="auto"/>
+          <w:kern w:val="2"/>
+          <w:sz w:val="24"/>
+          <w:szCs w:val="24"/>
+          <w:lang w:val="nl-BE"/>
+          <w14:ligatures w14:val="standardContextual"/>
+        </w:rPr>
         <w:id w:val="1325627997"/>
         <w:docPartObj>
           <w:docPartGallery w:val="Table of Contents"/>
@@ -39513,16 +40604,9 @@
       </w:sdtPr>
       <w:sdtEndPr>
         <w:rPr>
-          <w:rFonts w:asciiTheme="minorHAnsi" w:eastAsiaTheme="minorHAnsi" w:hAnsiTheme="minorHAnsi" w:cstheme="minorBidi"/>
           <w:b/>
           <w:bCs/>
           <w:noProof/>
-          <w:color w:val="auto"/>
-          <w:kern w:val="2"/>
-          <w:sz w:val="24"/>
-          <w:szCs w:val="24"/>
-          <w:lang w:val="nl-BE"/>
-          <w14:ligatures w14:val="standardContextual"/>
         </w:rPr>
       </w:sdtEndPr>
       <w:sdtContent>
@@ -39531,16 +40615,16 @@
             <w:pStyle w:val="TOCHeading"/>
             <w:rPr>
               <w:rFonts w:ascii="Calibri" w:hAnsi="Calibri" w:cs="Calibri"/>
+              <w:lang w:val="ru-RU"/>
             </w:rPr>
           </w:pPr>
-          <w:proofErr w:type="spellStart"/>
           <w:r>
             <w:rPr>
               <w:rFonts w:ascii="Calibri" w:hAnsi="Calibri" w:cs="Calibri"/>
+              <w:lang w:val="ru-RU"/>
             </w:rPr>
             <w:t>Содержание</w:t>
           </w:r>
-          <w:proofErr w:type="spellEnd"/>
         </w:p>
         <w:p>
           <w:pPr>
@@ -47132,7 +48216,7 @@
   <w:style w:type="paragraph" w:default="1" w:styleId="Normal">
     <w:name w:val="Normal"/>
     <w:qFormat/>
-    <w:rsid w:val="00193C8F"/>
+    <w:rsid w:val="00667BC8"/>
   </w:style>
   <w:style w:type="paragraph" w:styleId="Heading1">
     <w:name w:val="heading 1"/>

</xml_diff>